<commit_message>
fix(auth): Fixed the missing relationship between User and Account
</commit_message>
<xml_diff>
--- a/docs/Historico_de_Testes_LedgerCore.docx
+++ b/docs/Historico_de_Testes_LedgerCore.docx
@@ -99,7 +99,7 @@
                 <w:b/>
                 <w:sz w:val="18"/>
               </w:rPr>
-              <w:t>Data da execução</w:t>
+              <w:t>Última execução</w:t>
             </w:r>
           </w:p>
         </w:tc>
@@ -119,7 +119,7 @@
                 <w:b w:val="0"/>
                 <w:sz w:val="18"/>
               </w:rPr>
-              <w:t>14/10/2026 — 20:58 (America/Sao_Paulo)</w:t>
+              <w:t>14/10/2026 — 21:36 (America/Sao_Paulo)</w:t>
             </w:r>
           </w:p>
         </w:tc>
@@ -341,7 +341,7 @@
                 <w:b/>
                 <w:sz w:val="18"/>
               </w:rPr>
-              <w:t>8 executados • 8 aprovados</w:t>
+              <w:t>13 executados • 13 aprovados</w:t>
             </w:r>
           </w:p>
         </w:tc>
@@ -402,7 +402,7 @@
         <w:spacing w:after="100"/>
       </w:pPr>
       <w:r>
-        <w:t>A execução foi feita em três etapas para preservar evidência do defeito, validar a correção e confirmar a regressão completa.</w:t>
+        <w:t>O histórico preserva as execuções iniciais, as falhas encontradas, as correções e as regressões completas realizadas até esta versão.</w:t>
       </w:r>
     </w:p>
     <w:tbl>
@@ -1093,6 +1093,495 @@
           </w:p>
         </w:tc>
       </w:tr>
+      <w:tr>
+        <w:tc>
+          <w:tcPr>
+            <w:tcW w:type="dxa" w:w="1920"/>
+            <w:vAlign w:val="center"/>
+          </w:tcPr>
+          <w:p>
+            <w:pPr>
+              <w:spacing w:after="0"/>
+            </w:pPr>
+            <w:r/>
+            <w:r>
+              <w:rPr>
+                <w:rFonts w:ascii="Aptos" w:hAnsi="Aptos"/>
+                <w:b w:val="0"/>
+                <w:sz w:val="16"/>
+              </w:rPr>
+              <w:t>4</w:t>
+            </w:r>
+          </w:p>
+        </w:tc>
+        <w:tc>
+          <w:tcPr>
+            <w:tcW w:type="dxa" w:w="1920"/>
+            <w:vAlign w:val="center"/>
+          </w:tcPr>
+          <w:p>
+            <w:pPr>
+              <w:spacing w:after="0"/>
+            </w:pPr>
+            <w:r/>
+            <w:r>
+              <w:rPr>
+                <w:rFonts w:ascii="Aptos" w:hAnsi="Aptos"/>
+                <w:b w:val="0"/>
+                <w:sz w:val="16"/>
+              </w:rPr>
+              <w:t>21:27:14</w:t>
+            </w:r>
+          </w:p>
+        </w:tc>
+        <w:tc>
+          <w:tcPr>
+            <w:tcW w:type="dxa" w:w="1920"/>
+            <w:vAlign w:val="center"/>
+          </w:tcPr>
+          <w:p>
+            <w:pPr>
+              <w:spacing w:after="0"/>
+            </w:pPr>
+            <w:r/>
+            <w:r>
+              <w:rPr>
+                <w:rFonts w:ascii="Aptos" w:hAnsi="Aptos"/>
+                <w:b w:val="0"/>
+                <w:sz w:val="16"/>
+              </w:rPr>
+              <w:t>Suíte completa</w:t>
+            </w:r>
+          </w:p>
+        </w:tc>
+        <w:tc>
+          <w:tcPr>
+            <w:tcW w:type="dxa" w:w="1920"/>
+            <w:vAlign w:val="center"/>
+          </w:tcPr>
+          <w:p>
+            <w:pPr>
+              <w:spacing w:after="0"/>
+            </w:pPr>
+            <w:r/>
+            <w:r>
+              <w:rPr>
+                <w:rFonts w:ascii="Aptos" w:hAnsi="Aptos"/>
+                <w:b w:val="0"/>
+                <w:sz w:val="16"/>
+              </w:rPr>
+              <w:t>0</w:t>
+            </w:r>
+          </w:p>
+        </w:tc>
+        <w:tc>
+          <w:tcPr>
+            <w:tcW w:type="dxa" w:w="1920"/>
+            <w:vAlign w:val="center"/>
+          </w:tcPr>
+          <w:p>
+            <w:pPr>
+              <w:spacing w:after="0"/>
+            </w:pPr>
+            <w:r/>
+            <w:r>
+              <w:rPr>
+                <w:rFonts w:ascii="Aptos" w:hAnsi="Aptos"/>
+                <w:b w:val="0"/>
+                <w:sz w:val="16"/>
+              </w:rPr>
+              <w:t>0</w:t>
+            </w:r>
+          </w:p>
+        </w:tc>
+        <w:tc>
+          <w:tcPr>
+            <w:tcW w:type="dxa" w:w="1920"/>
+            <w:vAlign w:val="center"/>
+          </w:tcPr>
+          <w:p>
+            <w:pPr>
+              <w:spacing w:after="0"/>
+            </w:pPr>
+            <w:r/>
+            <w:r>
+              <w:rPr>
+                <w:rFonts w:ascii="Aptos" w:hAnsi="Aptos"/>
+                <w:b w:val="0"/>
+                <w:sz w:val="16"/>
+              </w:rPr>
+              <w:t>Compilação</w:t>
+            </w:r>
+          </w:p>
+        </w:tc>
+        <w:tc>
+          <w:tcPr>
+            <w:tcW w:type="dxa" w:w="1920"/>
+            <w:vAlign w:val="center"/>
+            <w:shd w:fill="FCE4D6"/>
+          </w:tcPr>
+          <w:p>
+            <w:pPr>
+              <w:spacing w:after="0"/>
+            </w:pPr>
+            <w:r/>
+            <w:r>
+              <w:rPr>
+                <w:rFonts w:ascii="Aptos" w:hAnsi="Aptos"/>
+                <w:b w:val="0"/>
+                <w:sz w:val="16"/>
+              </w:rPr>
+              <w:t>FALHOU</w:t>
+            </w:r>
+          </w:p>
+        </w:tc>
+        <w:tc>
+          <w:tcPr>
+            <w:tcW w:type="dxa" w:w="1920"/>
+            <w:vAlign w:val="center"/>
+          </w:tcPr>
+          <w:p>
+            <w:pPr>
+              <w:spacing w:after="0"/>
+            </w:pPr>
+            <w:r/>
+            <w:r>
+              <w:rPr>
+                <w:rFonts w:ascii="Aptos" w:hAnsi="Aptos"/>
+                <w:b w:val="0"/>
+                <w:sz w:val="16"/>
+              </w:rPr>
+              <w:t>Testes ainda referenciavam ownerName após a migração para owner.</w:t>
+            </w:r>
+          </w:p>
+        </w:tc>
+      </w:tr>
+      <w:tr>
+        <w:tc>
+          <w:tcPr>
+            <w:tcW w:type="dxa" w:w="1920"/>
+            <w:vAlign w:val="center"/>
+          </w:tcPr>
+          <w:p>
+            <w:pPr>
+              <w:spacing w:after="0"/>
+            </w:pPr>
+            <w:r/>
+            <w:r>
+              <w:rPr>
+                <w:rFonts w:ascii="Aptos" w:hAnsi="Aptos"/>
+                <w:b w:val="0"/>
+                <w:sz w:val="16"/>
+              </w:rPr>
+              <w:t>5</w:t>
+            </w:r>
+          </w:p>
+        </w:tc>
+        <w:tc>
+          <w:tcPr>
+            <w:tcW w:type="dxa" w:w="1920"/>
+            <w:vAlign w:val="center"/>
+          </w:tcPr>
+          <w:p>
+            <w:pPr>
+              <w:spacing w:after="0"/>
+            </w:pPr>
+            <w:r/>
+            <w:r>
+              <w:rPr>
+                <w:rFonts w:ascii="Aptos" w:hAnsi="Aptos"/>
+                <w:b w:val="0"/>
+                <w:sz w:val="16"/>
+              </w:rPr>
+              <w:t>21:36:10</w:t>
+            </w:r>
+          </w:p>
+        </w:tc>
+        <w:tc>
+          <w:tcPr>
+            <w:tcW w:type="dxa" w:w="1920"/>
+            <w:vAlign w:val="center"/>
+          </w:tcPr>
+          <w:p>
+            <w:pPr>
+              <w:spacing w:after="0"/>
+            </w:pPr>
+            <w:r/>
+            <w:r>
+              <w:rPr>
+                <w:rFonts w:ascii="Aptos" w:hAnsi="Aptos"/>
+                <w:b w:val="0"/>
+                <w:sz w:val="16"/>
+              </w:rPr>
+              <w:t>AccountEntityTest</w:t>
+            </w:r>
+          </w:p>
+        </w:tc>
+        <w:tc>
+          <w:tcPr>
+            <w:tcW w:type="dxa" w:w="1920"/>
+            <w:vAlign w:val="center"/>
+          </w:tcPr>
+          <w:p>
+            <w:pPr>
+              <w:spacing w:after="0"/>
+            </w:pPr>
+            <w:r/>
+            <w:r>
+              <w:rPr>
+                <w:rFonts w:ascii="Aptos" w:hAnsi="Aptos"/>
+                <w:b w:val="0"/>
+                <w:sz w:val="16"/>
+              </w:rPr>
+              <w:t>9</w:t>
+            </w:r>
+          </w:p>
+        </w:tc>
+        <w:tc>
+          <w:tcPr>
+            <w:tcW w:type="dxa" w:w="1920"/>
+            <w:vAlign w:val="center"/>
+          </w:tcPr>
+          <w:p>
+            <w:pPr>
+              <w:spacing w:after="0"/>
+            </w:pPr>
+            <w:r/>
+            <w:r>
+              <w:rPr>
+                <w:rFonts w:ascii="Aptos" w:hAnsi="Aptos"/>
+                <w:b w:val="0"/>
+                <w:sz w:val="16"/>
+              </w:rPr>
+              <w:t>9</w:t>
+            </w:r>
+          </w:p>
+        </w:tc>
+        <w:tc>
+          <w:tcPr>
+            <w:tcW w:type="dxa" w:w="1920"/>
+            <w:vAlign w:val="center"/>
+          </w:tcPr>
+          <w:p>
+            <w:pPr>
+              <w:spacing w:after="0"/>
+            </w:pPr>
+            <w:r/>
+            <w:r>
+              <w:rPr>
+                <w:rFonts w:ascii="Aptos" w:hAnsi="Aptos"/>
+                <w:b w:val="0"/>
+                <w:sz w:val="16"/>
+              </w:rPr>
+              <w:t>0</w:t>
+            </w:r>
+          </w:p>
+        </w:tc>
+        <w:tc>
+          <w:tcPr>
+            <w:tcW w:type="dxa" w:w="1920"/>
+            <w:vAlign w:val="center"/>
+            <w:shd w:fill="E2F0D9"/>
+          </w:tcPr>
+          <w:p>
+            <w:pPr>
+              <w:spacing w:after="0"/>
+            </w:pPr>
+            <w:r/>
+            <w:r>
+              <w:rPr>
+                <w:rFonts w:ascii="Aptos" w:hAnsi="Aptos"/>
+                <w:b w:val="0"/>
+                <w:sz w:val="16"/>
+              </w:rPr>
+              <w:t>PASSOU</w:t>
+            </w:r>
+          </w:p>
+        </w:tc>
+        <w:tc>
+          <w:tcPr>
+            <w:tcW w:type="dxa" w:w="1920"/>
+            <w:vAlign w:val="center"/>
+          </w:tcPr>
+          <w:p>
+            <w:pPr>
+              <w:spacing w:after="0"/>
+            </w:pPr>
+            <w:r/>
+            <w:r>
+              <w:rPr>
+                <w:rFonts w:ascii="Aptos" w:hAnsi="Aptos"/>
+                <w:b w:val="0"/>
+                <w:sz w:val="16"/>
+              </w:rPr>
+              <w:t>Testes atualizados para UserEntity, Set e associações bidirecionais.</w:t>
+            </w:r>
+          </w:p>
+        </w:tc>
+      </w:tr>
+      <w:tr>
+        <w:tc>
+          <w:tcPr>
+            <w:tcW w:type="dxa" w:w="1920"/>
+            <w:vAlign w:val="center"/>
+          </w:tcPr>
+          <w:p>
+            <w:pPr>
+              <w:spacing w:after="0"/>
+            </w:pPr>
+            <w:r/>
+            <w:r>
+              <w:rPr>
+                <w:rFonts w:ascii="Aptos" w:hAnsi="Aptos"/>
+                <w:b w:val="0"/>
+                <w:sz w:val="16"/>
+              </w:rPr>
+              <w:t>6</w:t>
+            </w:r>
+          </w:p>
+        </w:tc>
+        <w:tc>
+          <w:tcPr>
+            <w:tcW w:type="dxa" w:w="1920"/>
+            <w:vAlign w:val="center"/>
+          </w:tcPr>
+          <w:p>
+            <w:pPr>
+              <w:spacing w:after="0"/>
+            </w:pPr>
+            <w:r/>
+            <w:r>
+              <w:rPr>
+                <w:rFonts w:ascii="Aptos" w:hAnsi="Aptos"/>
+                <w:b w:val="0"/>
+                <w:sz w:val="16"/>
+              </w:rPr>
+              <w:t>21:36:24</w:t>
+            </w:r>
+          </w:p>
+        </w:tc>
+        <w:tc>
+          <w:tcPr>
+            <w:tcW w:type="dxa" w:w="1920"/>
+            <w:vAlign w:val="center"/>
+          </w:tcPr>
+          <w:p>
+            <w:pPr>
+              <w:spacing w:after="0"/>
+            </w:pPr>
+            <w:r/>
+            <w:r>
+              <w:rPr>
+                <w:rFonts w:ascii="Aptos" w:hAnsi="Aptos"/>
+                <w:b w:val="0"/>
+                <w:sz w:val="16"/>
+              </w:rPr>
+              <w:t>Suíte completa</w:t>
+            </w:r>
+          </w:p>
+        </w:tc>
+        <w:tc>
+          <w:tcPr>
+            <w:tcW w:type="dxa" w:w="1920"/>
+            <w:vAlign w:val="center"/>
+          </w:tcPr>
+          <w:p>
+            <w:pPr>
+              <w:spacing w:after="0"/>
+            </w:pPr>
+            <w:r/>
+            <w:r>
+              <w:rPr>
+                <w:rFonts w:ascii="Aptos" w:hAnsi="Aptos"/>
+                <w:b w:val="0"/>
+                <w:sz w:val="16"/>
+              </w:rPr>
+              <w:t>13</w:t>
+            </w:r>
+          </w:p>
+        </w:tc>
+        <w:tc>
+          <w:tcPr>
+            <w:tcW w:type="dxa" w:w="1920"/>
+            <w:vAlign w:val="center"/>
+          </w:tcPr>
+          <w:p>
+            <w:pPr>
+              <w:spacing w:after="0"/>
+            </w:pPr>
+            <w:r/>
+            <w:r>
+              <w:rPr>
+                <w:rFonts w:ascii="Aptos" w:hAnsi="Aptos"/>
+                <w:b w:val="0"/>
+                <w:sz w:val="16"/>
+              </w:rPr>
+              <w:t>13</w:t>
+            </w:r>
+          </w:p>
+        </w:tc>
+        <w:tc>
+          <w:tcPr>
+            <w:tcW w:type="dxa" w:w="1920"/>
+            <w:vAlign w:val="center"/>
+          </w:tcPr>
+          <w:p>
+            <w:pPr>
+              <w:spacing w:after="0"/>
+            </w:pPr>
+            <w:r/>
+            <w:r>
+              <w:rPr>
+                <w:rFonts w:ascii="Aptos" w:hAnsi="Aptos"/>
+                <w:b w:val="0"/>
+                <w:sz w:val="16"/>
+              </w:rPr>
+              <w:t>0</w:t>
+            </w:r>
+          </w:p>
+        </w:tc>
+        <w:tc>
+          <w:tcPr>
+            <w:tcW w:type="dxa" w:w="1920"/>
+            <w:vAlign w:val="center"/>
+            <w:shd w:fill="E2F0D9"/>
+          </w:tcPr>
+          <w:p>
+            <w:pPr>
+              <w:spacing w:after="0"/>
+            </w:pPr>
+            <w:r/>
+            <w:r>
+              <w:rPr>
+                <w:rFonts w:ascii="Aptos" w:hAnsi="Aptos"/>
+                <w:b w:val="0"/>
+                <w:sz w:val="16"/>
+              </w:rPr>
+              <w:t>PASSOU</w:t>
+            </w:r>
+          </w:p>
+        </w:tc>
+        <w:tc>
+          <w:tcPr>
+            <w:tcW w:type="dxa" w:w="1920"/>
+            <w:vAlign w:val="center"/>
+          </w:tcPr>
+          <w:p>
+            <w:pPr>
+              <w:spacing w:after="0"/>
+            </w:pPr>
+            <w:r/>
+            <w:r>
+              <w:rPr>
+                <w:rFonts w:ascii="Aptos" w:hAnsi="Aptos"/>
+                <w:b w:val="0"/>
+                <w:sz w:val="16"/>
+              </w:rPr>
+              <w:t>Schema validado sem FKs duplicadas nem tabela accounts_entries.</w:t>
+            </w:r>
+          </w:p>
+        </w:tc>
+      </w:tr>
     </w:tbl>
     <w:p>
       <w:pPr>
@@ -1376,7 +1865,7 @@
                 <w:b w:val="0"/>
                 <w:sz w:val="14"/>
               </w:rPr>
-              <w:t>Passou em 0,009 s; contexto, entidades e repositories inicializados.</w:t>
+              <w:t>Passou em 0,010 s; schema gerado com uma única FK owner_id e sem accounts_entries.</w:t>
             </w:r>
           </w:p>
         </w:tc>
@@ -1417,7 +1906,7 @@
                 <w:b w:val="0"/>
                 <w:sz w:val="14"/>
               </w:rPr>
-              <w:t>Nenhuma correção nesta rodada. O H2 já havia sido adicionado ao escopo de teste para isolar o ambiente.</w:t>
+              <w:t>Confirmou os mapeamentos User–Account e Account–Entry após a correção.</w:t>
             </w:r>
           </w:p>
         </w:tc>
@@ -1908,7 +2397,7 @@
                 <w:b w:val="0"/>
                 <w:sz w:val="14"/>
               </w:rPr>
-              <w:t>Criação via builder com id, titular, saldo, datas e lançamento mockado.</w:t>
+              <w:t>Criação via builder com id, owner mockado, saldo, datas e Set de lançamentos.</w:t>
             </w:r>
           </w:p>
         </w:tc>
@@ -1989,7 +2478,7 @@
                 <w:b w:val="0"/>
                 <w:sz w:val="14"/>
               </w:rPr>
-              <w:t>Nenhuma correção necessária.</w:t>
+              <w:t>Atualizado de ownerName/String para owner/UserEntity e de List para Set.</w:t>
             </w:r>
           </w:p>
         </w:tc>
@@ -2359,7 +2848,7 @@
                 <w:b w:val="0"/>
                 <w:sz w:val="14"/>
               </w:rPr>
-              <w:t>Getters retornam os novos valores e a mesma lista de lançamentos.</w:t>
+              <w:t>Getters retornam os novos valores, owner e o mesmo Set de lançamentos.</w:t>
             </w:r>
           </w:p>
         </w:tc>
@@ -2420,7 +2909,722 @@
                 <w:b w:val="0"/>
                 <w:sz w:val="14"/>
               </w:rPr>
-              <w:t>Nenhuma correção necessária.</w:t>
+              <w:t>Atualizado de setOwnerName para setOwner e de List para Set.</w:t>
+            </w:r>
+          </w:p>
+        </w:tc>
+      </w:tr>
+      <w:tr>
+        <w:tc>
+          <w:tcPr>
+            <w:tcW w:type="dxa" w:w="2195"/>
+            <w:vAlign w:val="center"/>
+          </w:tcPr>
+          <w:p>
+            <w:pPr>
+              <w:spacing w:after="0"/>
+            </w:pPr>
+            <w:r/>
+            <w:r>
+              <w:rPr>
+                <w:rFonts w:ascii="Aptos" w:hAnsi="Aptos"/>
+                <w:b w:val="0"/>
+                <w:sz w:val="14"/>
+              </w:rPr>
+              <w:t>9</w:t>
+            </w:r>
+          </w:p>
+        </w:tc>
+        <w:tc>
+          <w:tcPr>
+            <w:tcW w:type="dxa" w:w="2195"/>
+            <w:vAlign w:val="center"/>
+          </w:tcPr>
+          <w:p>
+            <w:pPr>
+              <w:spacing w:after="0"/>
+            </w:pPr>
+            <w:r/>
+            <w:r>
+              <w:rPr>
+                <w:rFonts w:ascii="Aptos" w:hAnsi="Aptos"/>
+                <w:b w:val="0"/>
+                <w:sz w:val="14"/>
+              </w:rPr>
+              <w:t>AccountEntityTest.constructorsShouldInitializeEntriesAsEmptySet</w:t>
+            </w:r>
+          </w:p>
+        </w:tc>
+        <w:tc>
+          <w:tcPr>
+            <w:tcW w:type="dxa" w:w="2195"/>
+            <w:vAlign w:val="center"/>
+          </w:tcPr>
+          <w:p>
+            <w:pPr>
+              <w:spacing w:after="0"/>
+            </w:pPr>
+            <w:r/>
+            <w:r>
+              <w:rPr>
+                <w:rFonts w:ascii="Aptos" w:hAnsi="Aptos"/>
+                <w:b w:val="0"/>
+                <w:sz w:val="14"/>
+              </w:rPr>
+              <w:t>Criação por builder e pelo construtor JPA sem informar entries.</w:t>
+            </w:r>
+          </w:p>
+        </w:tc>
+        <w:tc>
+          <w:tcPr>
+            <w:tcW w:type="dxa" w:w="2195"/>
+            <w:vAlign w:val="center"/>
+          </w:tcPr>
+          <w:p>
+            <w:pPr>
+              <w:spacing w:after="0"/>
+            </w:pPr>
+            <w:r/>
+            <w:r>
+              <w:rPr>
+                <w:rFonts w:ascii="Aptos" w:hAnsi="Aptos"/>
+                <w:b w:val="0"/>
+                <w:sz w:val="14"/>
+              </w:rPr>
+              <w:t>A coleção deve existir e começar vazia nos dois caminhos.</w:t>
+            </w:r>
+          </w:p>
+        </w:tc>
+        <w:tc>
+          <w:tcPr>
+            <w:tcW w:type="dxa" w:w="2195"/>
+            <w:vAlign w:val="center"/>
+          </w:tcPr>
+          <w:p>
+            <w:pPr>
+              <w:spacing w:after="0"/>
+            </w:pPr>
+            <w:r/>
+            <w:r>
+              <w:rPr>
+                <w:rFonts w:ascii="Aptos" w:hAnsi="Aptos"/>
+                <w:b w:val="0"/>
+                <w:sz w:val="14"/>
+              </w:rPr>
+              <w:t>Os dois objetos retornaram Set vazio e não nulo.</w:t>
+            </w:r>
+          </w:p>
+        </w:tc>
+        <w:tc>
+          <w:tcPr>
+            <w:tcW w:type="dxa" w:w="2195"/>
+            <w:vAlign w:val="center"/>
+            <w:shd w:fill="E2F0D9"/>
+          </w:tcPr>
+          <w:p>
+            <w:pPr>
+              <w:spacing w:after="0"/>
+            </w:pPr>
+            <w:r/>
+            <w:r>
+              <w:rPr>
+                <w:rFonts w:ascii="Aptos" w:hAnsi="Aptos"/>
+                <w:b w:val="0"/>
+                <w:sz w:val="14"/>
+              </w:rPr>
+              <w:t>SIM — PASSOU</w:t>
+            </w:r>
+          </w:p>
+        </w:tc>
+        <w:tc>
+          <w:tcPr>
+            <w:tcW w:type="dxa" w:w="2195"/>
+            <w:vAlign w:val="center"/>
+          </w:tcPr>
+          <w:p>
+            <w:pPr>
+              <w:spacing w:after="0"/>
+            </w:pPr>
+            <w:r/>
+            <w:r>
+              <w:rPr>
+                <w:rFonts w:ascii="Aptos" w:hAnsi="Aptos"/>
+                <w:b w:val="0"/>
+                <w:sz w:val="14"/>
+              </w:rPr>
+              <w:t>Adicionados @Builder.Default e new HashSet&lt;&gt;() ao campo entries.</w:t>
+            </w:r>
+          </w:p>
+        </w:tc>
+      </w:tr>
+      <w:tr>
+        <w:tc>
+          <w:tcPr>
+            <w:tcW w:type="dxa" w:w="2195"/>
+            <w:vAlign w:val="center"/>
+          </w:tcPr>
+          <w:p>
+            <w:pPr>
+              <w:spacing w:after="0"/>
+            </w:pPr>
+            <w:r/>
+            <w:r>
+              <w:rPr>
+                <w:rFonts w:ascii="Aptos" w:hAnsi="Aptos"/>
+                <w:b w:val="0"/>
+                <w:sz w:val="14"/>
+              </w:rPr>
+              <w:t>10</w:t>
+            </w:r>
+          </w:p>
+        </w:tc>
+        <w:tc>
+          <w:tcPr>
+            <w:tcW w:type="dxa" w:w="2195"/>
+            <w:vAlign w:val="center"/>
+          </w:tcPr>
+          <w:p>
+            <w:pPr>
+              <w:spacing w:after="0"/>
+            </w:pPr>
+            <w:r/>
+            <w:r>
+              <w:rPr>
+                <w:rFonts w:ascii="Aptos" w:hAnsi="Aptos"/>
+                <w:b w:val="0"/>
+                <w:sz w:val="14"/>
+              </w:rPr>
+              <w:t>AccountEntityTest.addEntryShouldSynchronizeBothSidesOfRelationship</w:t>
+            </w:r>
+          </w:p>
+        </w:tc>
+        <w:tc>
+          <w:tcPr>
+            <w:tcW w:type="dxa" w:w="2195"/>
+            <w:vAlign w:val="center"/>
+          </w:tcPr>
+          <w:p>
+            <w:pPr>
+              <w:spacing w:after="0"/>
+            </w:pPr>
+            <w:r/>
+            <w:r>
+              <w:rPr>
+                <w:rFonts w:ascii="Aptos" w:hAnsi="Aptos"/>
+                <w:b w:val="0"/>
+                <w:sz w:val="14"/>
+              </w:rPr>
+              <w:t>Inclusão de EntrieEntity pelo método addEntry.</w:t>
+            </w:r>
+          </w:p>
+        </w:tc>
+        <w:tc>
+          <w:tcPr>
+            <w:tcW w:type="dxa" w:w="2195"/>
+            <w:vAlign w:val="center"/>
+          </w:tcPr>
+          <w:p>
+            <w:pPr>
+              <w:spacing w:after="0"/>
+            </w:pPr>
+            <w:r/>
+            <w:r>
+              <w:rPr>
+                <w:rFonts w:ascii="Aptos" w:hAnsi="Aptos"/>
+                <w:b w:val="0"/>
+                <w:sz w:val="14"/>
+              </w:rPr>
+              <w:t>Entry entra no Set e recebe a AccountEntity como lado proprietário.</w:t>
+            </w:r>
+          </w:p>
+        </w:tc>
+        <w:tc>
+          <w:tcPr>
+            <w:tcW w:type="dxa" w:w="2195"/>
+            <w:vAlign w:val="center"/>
+          </w:tcPr>
+          <w:p>
+            <w:pPr>
+              <w:spacing w:after="0"/>
+            </w:pPr>
+            <w:r/>
+            <w:r>
+              <w:rPr>
+                <w:rFonts w:ascii="Aptos" w:hAnsi="Aptos"/>
+                <w:b w:val="0"/>
+                <w:sz w:val="14"/>
+              </w:rPr>
+              <w:t>Coleção atualizada; Mockito confirmou entry.setAccount(account).</w:t>
+            </w:r>
+          </w:p>
+        </w:tc>
+        <w:tc>
+          <w:tcPr>
+            <w:tcW w:type="dxa" w:w="2195"/>
+            <w:vAlign w:val="center"/>
+            <w:shd w:fill="E2F0D9"/>
+          </w:tcPr>
+          <w:p>
+            <w:pPr>
+              <w:spacing w:after="0"/>
+            </w:pPr>
+            <w:r/>
+            <w:r>
+              <w:rPr>
+                <w:rFonts w:ascii="Aptos" w:hAnsi="Aptos"/>
+                <w:b w:val="0"/>
+                <w:sz w:val="14"/>
+              </w:rPr>
+              <w:t>SIM — PASSOU</w:t>
+            </w:r>
+          </w:p>
+        </w:tc>
+        <w:tc>
+          <w:tcPr>
+            <w:tcW w:type="dxa" w:w="2195"/>
+            <w:vAlign w:val="center"/>
+          </w:tcPr>
+          <w:p>
+            <w:pPr>
+              <w:spacing w:after="0"/>
+            </w:pPr>
+            <w:r/>
+            <w:r>
+              <w:rPr>
+                <w:rFonts w:ascii="Aptos" w:hAnsi="Aptos"/>
+                <w:b w:val="0"/>
+                <w:sz w:val="14"/>
+              </w:rPr>
+              <w:t>Criado método addEntry para manter os dois lados sincronizados.</w:t>
+            </w:r>
+          </w:p>
+        </w:tc>
+      </w:tr>
+      <w:tr>
+        <w:tc>
+          <w:tcPr>
+            <w:tcW w:type="dxa" w:w="2195"/>
+            <w:vAlign w:val="center"/>
+          </w:tcPr>
+          <w:p>
+            <w:pPr>
+              <w:spacing w:after="0"/>
+            </w:pPr>
+            <w:r/>
+            <w:r>
+              <w:rPr>
+                <w:rFonts w:ascii="Aptos" w:hAnsi="Aptos"/>
+                <w:b w:val="0"/>
+                <w:sz w:val="14"/>
+              </w:rPr>
+              <w:t>11</w:t>
+            </w:r>
+          </w:p>
+        </w:tc>
+        <w:tc>
+          <w:tcPr>
+            <w:tcW w:type="dxa" w:w="2195"/>
+            <w:vAlign w:val="center"/>
+          </w:tcPr>
+          <w:p>
+            <w:pPr>
+              <w:spacing w:after="0"/>
+            </w:pPr>
+            <w:r/>
+            <w:r>
+              <w:rPr>
+                <w:rFonts w:ascii="Aptos" w:hAnsi="Aptos"/>
+                <w:b w:val="0"/>
+                <w:sz w:val="14"/>
+              </w:rPr>
+              <w:t>AccountEntityTest.removeEntryShouldSynchronizeBothSidesOfRelationship</w:t>
+            </w:r>
+          </w:p>
+        </w:tc>
+        <w:tc>
+          <w:tcPr>
+            <w:tcW w:type="dxa" w:w="2195"/>
+            <w:vAlign w:val="center"/>
+          </w:tcPr>
+          <w:p>
+            <w:pPr>
+              <w:spacing w:after="0"/>
+            </w:pPr>
+            <w:r/>
+            <w:r>
+              <w:rPr>
+                <w:rFonts w:ascii="Aptos" w:hAnsi="Aptos"/>
+                <w:b w:val="0"/>
+                <w:sz w:val="14"/>
+              </w:rPr>
+              <w:t>Remoção de EntrieEntity associada pelo método removeEntry.</w:t>
+            </w:r>
+          </w:p>
+        </w:tc>
+        <w:tc>
+          <w:tcPr>
+            <w:tcW w:type="dxa" w:w="2195"/>
+            <w:vAlign w:val="center"/>
+          </w:tcPr>
+          <w:p>
+            <w:pPr>
+              <w:spacing w:after="0"/>
+            </w:pPr>
+            <w:r/>
+            <w:r>
+              <w:rPr>
+                <w:rFonts w:ascii="Aptos" w:hAnsi="Aptos"/>
+                <w:b w:val="0"/>
+                <w:sz w:val="14"/>
+              </w:rPr>
+              <w:t>Entry sai do Set e sua referência account é removida.</w:t>
+            </w:r>
+          </w:p>
+        </w:tc>
+        <w:tc>
+          <w:tcPr>
+            <w:tcW w:type="dxa" w:w="2195"/>
+            <w:vAlign w:val="center"/>
+          </w:tcPr>
+          <w:p>
+            <w:pPr>
+              <w:spacing w:after="0"/>
+            </w:pPr>
+            <w:r/>
+            <w:r>
+              <w:rPr>
+                <w:rFonts w:ascii="Aptos" w:hAnsi="Aptos"/>
+                <w:b w:val="0"/>
+                <w:sz w:val="14"/>
+              </w:rPr>
+              <w:t>Coleção atualizada; Mockito confirmou entry.setAccount(null).</w:t>
+            </w:r>
+          </w:p>
+        </w:tc>
+        <w:tc>
+          <w:tcPr>
+            <w:tcW w:type="dxa" w:w="2195"/>
+            <w:vAlign w:val="center"/>
+            <w:shd w:fill="E2F0D9"/>
+          </w:tcPr>
+          <w:p>
+            <w:pPr>
+              <w:spacing w:after="0"/>
+            </w:pPr>
+            <w:r/>
+            <w:r>
+              <w:rPr>
+                <w:rFonts w:ascii="Aptos" w:hAnsi="Aptos"/>
+                <w:b w:val="0"/>
+                <w:sz w:val="14"/>
+              </w:rPr>
+              <w:t>SIM — PASSOU</w:t>
+            </w:r>
+          </w:p>
+        </w:tc>
+        <w:tc>
+          <w:tcPr>
+            <w:tcW w:type="dxa" w:w="2195"/>
+            <w:vAlign w:val="center"/>
+          </w:tcPr>
+          <w:p>
+            <w:pPr>
+              <w:spacing w:after="0"/>
+            </w:pPr>
+            <w:r/>
+            <w:r>
+              <w:rPr>
+                <w:rFonts w:ascii="Aptos" w:hAnsi="Aptos"/>
+                <w:b w:val="0"/>
+                <w:sz w:val="14"/>
+              </w:rPr>
+              <w:t>Criado método removeEntry para manter os dois lados sincronizados.</w:t>
+            </w:r>
+          </w:p>
+        </w:tc>
+      </w:tr>
+      <w:tr>
+        <w:tc>
+          <w:tcPr>
+            <w:tcW w:type="dxa" w:w="2195"/>
+            <w:vAlign w:val="center"/>
+          </w:tcPr>
+          <w:p>
+            <w:pPr>
+              <w:spacing w:after="0"/>
+            </w:pPr>
+            <w:r/>
+            <w:r>
+              <w:rPr>
+                <w:rFonts w:ascii="Aptos" w:hAnsi="Aptos"/>
+                <w:b w:val="0"/>
+                <w:sz w:val="14"/>
+              </w:rPr>
+              <w:t>12</w:t>
+            </w:r>
+          </w:p>
+        </w:tc>
+        <w:tc>
+          <w:tcPr>
+            <w:tcW w:type="dxa" w:w="2195"/>
+            <w:vAlign w:val="center"/>
+          </w:tcPr>
+          <w:p>
+            <w:pPr>
+              <w:spacing w:after="0"/>
+            </w:pPr>
+            <w:r/>
+            <w:r>
+              <w:rPr>
+                <w:rFonts w:ascii="Aptos" w:hAnsi="Aptos"/>
+                <w:b w:val="0"/>
+                <w:sz w:val="14"/>
+              </w:rPr>
+              <w:t>AccountEntityTest.removeEntryShouldNotChangeUnassociatedEntry</w:t>
+            </w:r>
+          </w:p>
+        </w:tc>
+        <w:tc>
+          <w:tcPr>
+            <w:tcW w:type="dxa" w:w="2195"/>
+            <w:vAlign w:val="center"/>
+          </w:tcPr>
+          <w:p>
+            <w:pPr>
+              <w:spacing w:after="0"/>
+            </w:pPr>
+            <w:r/>
+            <w:r>
+              <w:rPr>
+                <w:rFonts w:ascii="Aptos" w:hAnsi="Aptos"/>
+                <w:b w:val="0"/>
+                <w:sz w:val="14"/>
+              </w:rPr>
+              <w:t>Tentativa de remover Entry que não pertence à conta.</w:t>
+            </w:r>
+          </w:p>
+        </w:tc>
+        <w:tc>
+          <w:tcPr>
+            <w:tcW w:type="dxa" w:w="2195"/>
+            <w:vAlign w:val="center"/>
+          </w:tcPr>
+          <w:p>
+            <w:pPr>
+              <w:spacing w:after="0"/>
+            </w:pPr>
+            <w:r/>
+            <w:r>
+              <w:rPr>
+                <w:rFonts w:ascii="Aptos" w:hAnsi="Aptos"/>
+                <w:b w:val="0"/>
+                <w:sz w:val="14"/>
+              </w:rPr>
+              <w:t>Coleção permanece vazia e o mock não recebe interação.</w:t>
+            </w:r>
+          </w:p>
+        </w:tc>
+        <w:tc>
+          <w:tcPr>
+            <w:tcW w:type="dxa" w:w="2195"/>
+            <w:vAlign w:val="center"/>
+          </w:tcPr>
+          <w:p>
+            <w:pPr>
+              <w:spacing w:after="0"/>
+            </w:pPr>
+            <w:r/>
+            <w:r>
+              <w:rPr>
+                <w:rFonts w:ascii="Aptos" w:hAnsi="Aptos"/>
+                <w:b w:val="0"/>
+                <w:sz w:val="14"/>
+              </w:rPr>
+              <w:t>Coleção permaneceu vazia; Mockito confirmou zero interações.</w:t>
+            </w:r>
+          </w:p>
+        </w:tc>
+        <w:tc>
+          <w:tcPr>
+            <w:tcW w:type="dxa" w:w="2195"/>
+            <w:vAlign w:val="center"/>
+            <w:shd w:fill="E2F0D9"/>
+          </w:tcPr>
+          <w:p>
+            <w:pPr>
+              <w:spacing w:after="0"/>
+            </w:pPr>
+            <w:r/>
+            <w:r>
+              <w:rPr>
+                <w:rFonts w:ascii="Aptos" w:hAnsi="Aptos"/>
+                <w:b w:val="0"/>
+                <w:sz w:val="14"/>
+              </w:rPr>
+              <w:t>SIM — PASSOU</w:t>
+            </w:r>
+          </w:p>
+        </w:tc>
+        <w:tc>
+          <w:tcPr>
+            <w:tcW w:type="dxa" w:w="2195"/>
+            <w:vAlign w:val="center"/>
+          </w:tcPr>
+          <w:p>
+            <w:pPr>
+              <w:spacing w:after="0"/>
+            </w:pPr>
+            <w:r/>
+            <w:r>
+              <w:rPr>
+                <w:rFonts w:ascii="Aptos" w:hAnsi="Aptos"/>
+                <w:b w:val="0"/>
+                <w:sz w:val="14"/>
+              </w:rPr>
+              <w:t>Proteção implementada pelo retorno de Set.remove antes de limpar o lado proprietário.</w:t>
+            </w:r>
+          </w:p>
+        </w:tc>
+      </w:tr>
+      <w:tr>
+        <w:tc>
+          <w:tcPr>
+            <w:tcW w:type="dxa" w:w="2195"/>
+            <w:vAlign w:val="center"/>
+          </w:tcPr>
+          <w:p>
+            <w:pPr>
+              <w:spacing w:after="0"/>
+            </w:pPr>
+            <w:r/>
+            <w:r>
+              <w:rPr>
+                <w:rFonts w:ascii="Aptos" w:hAnsi="Aptos"/>
+                <w:b w:val="0"/>
+                <w:sz w:val="14"/>
+              </w:rPr>
+              <w:t>13</w:t>
+            </w:r>
+          </w:p>
+        </w:tc>
+        <w:tc>
+          <w:tcPr>
+            <w:tcW w:type="dxa" w:w="2195"/>
+            <w:vAlign w:val="center"/>
+          </w:tcPr>
+          <w:p>
+            <w:pPr>
+              <w:spacing w:after="0"/>
+            </w:pPr>
+            <w:r/>
+            <w:r>
+              <w:rPr>
+                <w:rFonts w:ascii="Aptos" w:hAnsi="Aptos"/>
+                <w:b w:val="0"/>
+                <w:sz w:val="14"/>
+              </w:rPr>
+              <w:t>AccountEntityTest.mappingsShouldUseSingleOwningSideAndMappedByInverseSides</w:t>
+            </w:r>
+          </w:p>
+        </w:tc>
+        <w:tc>
+          <w:tcPr>
+            <w:tcW w:type="dxa" w:w="2195"/>
+            <w:vAlign w:val="center"/>
+          </w:tcPr>
+          <w:p>
+            <w:pPr>
+              <w:spacing w:after="0"/>
+            </w:pPr>
+            <w:r/>
+            <w:r>
+              <w:rPr>
+                <w:rFonts w:ascii="Aptos" w:hAnsi="Aptos"/>
+                <w:b w:val="0"/>
+                <w:sz w:val="14"/>
+              </w:rPr>
+              <w:t>Inspeção das anotações JPA dos relacionamentos User–Account e Account–Entry.</w:t>
+            </w:r>
+          </w:p>
+        </w:tc>
+        <w:tc>
+          <w:tcPr>
+            <w:tcW w:type="dxa" w:w="2195"/>
+            <w:vAlign w:val="center"/>
+          </w:tcPr>
+          <w:p>
+            <w:pPr>
+              <w:spacing w:after="0"/>
+            </w:pPr>
+            <w:r/>
+            <w:r>
+              <w:rPr>
+                <w:rFonts w:ascii="Aptos" w:hAnsi="Aptos"/>
+                <w:b w:val="0"/>
+                <w:sz w:val="14"/>
+              </w:rPr>
+              <w:t>owner_id único/não nulo; mappedBy owner e account; orphanRemoval ativo.</w:t>
+            </w:r>
+          </w:p>
+        </w:tc>
+        <w:tc>
+          <w:tcPr>
+            <w:tcW w:type="dxa" w:w="2195"/>
+            <w:vAlign w:val="center"/>
+          </w:tcPr>
+          <w:p>
+            <w:pPr>
+              <w:spacing w:after="0"/>
+            </w:pPr>
+            <w:r/>
+            <w:r>
+              <w:rPr>
+                <w:rFonts w:ascii="Aptos" w:hAnsi="Aptos"/>
+                <w:b w:val="0"/>
+                <w:sz w:val="14"/>
+              </w:rPr>
+              <w:t>Todas as propriedades das anotações foram confirmadas.</w:t>
+            </w:r>
+          </w:p>
+        </w:tc>
+        <w:tc>
+          <w:tcPr>
+            <w:tcW w:type="dxa" w:w="2195"/>
+            <w:vAlign w:val="center"/>
+            <w:shd w:fill="E2F0D9"/>
+          </w:tcPr>
+          <w:p>
+            <w:pPr>
+              <w:spacing w:after="0"/>
+            </w:pPr>
+            <w:r/>
+            <w:r>
+              <w:rPr>
+                <w:rFonts w:ascii="Aptos" w:hAnsi="Aptos"/>
+                <w:b w:val="0"/>
+                <w:sz w:val="14"/>
+              </w:rPr>
+              <w:t>SIM — PASSOU</w:t>
+            </w:r>
+          </w:p>
+        </w:tc>
+        <w:tc>
+          <w:tcPr>
+            <w:tcW w:type="dxa" w:w="2195"/>
+            <w:vAlign w:val="center"/>
+          </w:tcPr>
+          <w:p>
+            <w:pPr>
+              <w:spacing w:after="0"/>
+            </w:pPr>
+            <w:r/>
+            <w:r>
+              <w:rPr>
+                <w:rFonts w:ascii="Aptos" w:hAnsi="Aptos"/>
+                <w:b w:val="0"/>
+                <w:sz w:val="14"/>
+              </w:rPr>
+              <w:t>Teste de regressão criado para impedir retorno das duas FKs/tabela intermediária.</w:t>
             </w:r>
           </w:p>
         </w:tc>
@@ -2432,7 +3636,7 @@
         <w:spacing w:before="160" w:after="80"/>
       </w:pPr>
       <w:r>
-        <w:t>3. Correção aplicada nesta rodada</w:t>
+        <w:t>3. Correções aplicadas</w:t>
       </w:r>
     </w:p>
     <w:tbl>
@@ -2585,6 +3789,138 @@
           </w:p>
         </w:tc>
       </w:tr>
+      <w:tr>
+        <w:trPr>
+          <w:cantSplit/>
+        </w:trPr>
+        <w:tc>
+          <w:tcPr>
+            <w:tcW w:type="dxa" w:w="3118"/>
+            <w:vAlign w:val="center"/>
+          </w:tcPr>
+          <w:p>
+            <w:pPr>
+              <w:spacing w:after="0"/>
+            </w:pPr>
+            <w:r/>
+            <w:r>
+              <w:rPr>
+                <w:rFonts w:ascii="Aptos" w:hAnsi="Aptos"/>
+                <w:b w:val="0"/>
+                <w:sz w:val="16"/>
+              </w:rPr>
+              <w:t>AccountEntityTest.java — owner</w:t>
+            </w:r>
+          </w:p>
+        </w:tc>
+        <w:tc>
+          <w:tcPr>
+            <w:tcW w:type="dxa" w:w="5102"/>
+            <w:vAlign w:val="center"/>
+          </w:tcPr>
+          <w:p>
+            <w:pPr>
+              <w:spacing w:after="0"/>
+            </w:pPr>
+            <w:r/>
+            <w:r>
+              <w:rPr>
+                <w:rFonts w:ascii="Aptos" w:hAnsi="Aptos"/>
+                <w:b w:val="0"/>
+                <w:sz w:val="16"/>
+              </w:rPr>
+              <w:t>Testes chamavam ownerName/getOwnerName/setOwnerName, removidos na nova modelagem.</w:t>
+            </w:r>
+          </w:p>
+        </w:tc>
+        <w:tc>
+          <w:tcPr>
+            <w:tcW w:type="dxa" w:w="7087"/>
+            <w:vAlign w:val="center"/>
+            <w:shd w:fill="E2F0D9"/>
+          </w:tcPr>
+          <w:p>
+            <w:pPr>
+              <w:spacing w:after="0"/>
+            </w:pPr>
+            <w:r/>
+            <w:r>
+              <w:rPr>
+                <w:rFonts w:ascii="Aptos" w:hAnsi="Aptos"/>
+                <w:b w:val="0"/>
+                <w:sz w:val="16"/>
+              </w:rPr>
+              <w:t>Testes migrados para UserEntity owner, usando mock Mockito e assertSame.</w:t>
+            </w:r>
+          </w:p>
+        </w:tc>
+      </w:tr>
+      <w:tr>
+        <w:trPr>
+          <w:cantSplit/>
+        </w:trPr>
+        <w:tc>
+          <w:tcPr>
+            <w:tcW w:type="dxa" w:w="3118"/>
+            <w:vAlign w:val="center"/>
+          </w:tcPr>
+          <w:p>
+            <w:pPr>
+              <w:spacing w:after="0"/>
+            </w:pPr>
+            <w:r/>
+            <w:r>
+              <w:rPr>
+                <w:rFonts w:ascii="Aptos" w:hAnsi="Aptos"/>
+                <w:b w:val="0"/>
+                <w:sz w:val="16"/>
+              </w:rPr>
+              <w:t>AccountEntity.java e teste — entries</w:t>
+            </w:r>
+          </w:p>
+        </w:tc>
+        <w:tc>
+          <w:tcPr>
+            <w:tcW w:type="dxa" w:w="5102"/>
+            <w:vAlign w:val="center"/>
+          </w:tcPr>
+          <w:p>
+            <w:pPr>
+              <w:spacing w:after="0"/>
+            </w:pPr>
+            <w:r/>
+            <w:r>
+              <w:rPr>
+                <w:rFonts w:ascii="Aptos" w:hAnsi="Aptos"/>
+                <w:b w:val="0"/>
+                <w:sz w:val="16"/>
+              </w:rPr>
+              <w:t>Implementação passou de List para Set; coleção podia iniciar nula e os lados não eram sincronizados.</w:t>
+            </w:r>
+          </w:p>
+        </w:tc>
+        <w:tc>
+          <w:tcPr>
+            <w:tcW w:type="dxa" w:w="7087"/>
+            <w:vAlign w:val="center"/>
+            <w:shd w:fill="E2F0D9"/>
+          </w:tcPr>
+          <w:p>
+            <w:pPr>
+              <w:spacing w:after="0"/>
+            </w:pPr>
+            <w:r/>
+            <w:r>
+              <w:rPr>
+                <w:rFonts w:ascii="Aptos" w:hAnsi="Aptos"/>
+                <w:b w:val="0"/>
+                <w:sz w:val="16"/>
+              </w:rPr>
+              <w:t>Testes migrados para Set; inicialização com HashSet e métodos addEntry/removeEntry adicionados.</w:t>
+            </w:r>
+          </w:p>
+        </w:tc>
+      </w:tr>
     </w:tbl>
     <w:p>
       <w:pPr>
@@ -2646,7 +3982,7 @@
         <w:t xml:space="preserve">Conclusão: </w:t>
       </w:r>
       <w:r>
-        <w:t>a suíte atual está verde e o comportamento de saldo padrão do AccountEntity está protegido contra regressão.</w:t>
+        <w:t>a suíte atual está verde; os relacionamentos User–Account e Account–Entry usam uma única FK e estão protegidos por testes de regressão.</w:t>
       </w:r>
     </w:p>
     <w:sectPr>

</xml_diff>

<commit_message>
feat(auth): added Docker to the project
</commit_message>
<xml_diff>
--- a/docs/Historico_de_Testes_LedgerCore.docx
+++ b/docs/Historico_de_Testes_LedgerCore.docx
@@ -119,7 +119,7 @@
                 <w:b w:val="0"/>
                 <w:sz w:val="18"/>
               </w:rPr>
-              <w:t>14/10/2026 — 21:36 (America/Sao_Paulo)</w:t>
+              <w:t>14/10/2026 — 22:13 (America/Sao_Paulo)</w:t>
             </w:r>
           </w:p>
         </w:tc>
@@ -341,7 +341,7 @@
                 <w:b/>
                 <w:sz w:val="18"/>
               </w:rPr>
-              <w:t>13 executados • 13 aprovados</w:t>
+              <w:t>16 executados • 16 aprovados</w:t>
             </w:r>
           </w:p>
         </w:tc>
@@ -1578,6 +1578,332 @@
                 <w:sz w:val="16"/>
               </w:rPr>
               <w:t>Schema validado sem FKs duplicadas nem tabela accounts_entries.</w:t>
+            </w:r>
+          </w:p>
+        </w:tc>
+      </w:tr>
+      <w:tr>
+        <w:tc>
+          <w:tcPr>
+            <w:tcW w:type="dxa" w:w="1920"/>
+            <w:vAlign w:val="center"/>
+          </w:tcPr>
+          <w:p>
+            <w:pPr>
+              <w:spacing w:after="0"/>
+            </w:pPr>
+            <w:r/>
+            <w:r>
+              <w:rPr>
+                <w:rFonts w:ascii="Aptos" w:hAnsi="Aptos"/>
+                <w:b w:val="0"/>
+                <w:sz w:val="16"/>
+              </w:rPr>
+              <w:t>7</w:t>
+            </w:r>
+          </w:p>
+        </w:tc>
+        <w:tc>
+          <w:tcPr>
+            <w:tcW w:type="dxa" w:w="1920"/>
+            <w:vAlign w:val="center"/>
+          </w:tcPr>
+          <w:p>
+            <w:pPr>
+              <w:spacing w:after="0"/>
+            </w:pPr>
+            <w:r/>
+            <w:r>
+              <w:rPr>
+                <w:rFonts w:ascii="Aptos" w:hAnsi="Aptos"/>
+                <w:b w:val="0"/>
+                <w:sz w:val="16"/>
+              </w:rPr>
+              <w:t>22:12:24</w:t>
+            </w:r>
+          </w:p>
+        </w:tc>
+        <w:tc>
+          <w:tcPr>
+            <w:tcW w:type="dxa" w:w="1920"/>
+            <w:vAlign w:val="center"/>
+          </w:tcPr>
+          <w:p>
+            <w:pPr>
+              <w:spacing w:after="0"/>
+            </w:pPr>
+            <w:r/>
+            <w:r>
+              <w:rPr>
+                <w:rFonts w:ascii="Aptos" w:hAnsi="Aptos"/>
+                <w:b w:val="0"/>
+                <w:sz w:val="16"/>
+              </w:rPr>
+              <w:t>DockerConfigurationTest</w:t>
+            </w:r>
+          </w:p>
+        </w:tc>
+        <w:tc>
+          <w:tcPr>
+            <w:tcW w:type="dxa" w:w="1920"/>
+            <w:vAlign w:val="center"/>
+          </w:tcPr>
+          <w:p>
+            <w:pPr>
+              <w:spacing w:after="0"/>
+            </w:pPr>
+            <w:r/>
+            <w:r>
+              <w:rPr>
+                <w:rFonts w:ascii="Aptos" w:hAnsi="Aptos"/>
+                <w:b w:val="0"/>
+                <w:sz w:val="16"/>
+              </w:rPr>
+              <w:t>3</w:t>
+            </w:r>
+          </w:p>
+        </w:tc>
+        <w:tc>
+          <w:tcPr>
+            <w:tcW w:type="dxa" w:w="1920"/>
+            <w:vAlign w:val="center"/>
+          </w:tcPr>
+          <w:p>
+            <w:pPr>
+              <w:spacing w:after="0"/>
+            </w:pPr>
+            <w:r/>
+            <w:r>
+              <w:rPr>
+                <w:rFonts w:ascii="Aptos" w:hAnsi="Aptos"/>
+                <w:b w:val="0"/>
+                <w:sz w:val="16"/>
+              </w:rPr>
+              <w:t>3</w:t>
+            </w:r>
+          </w:p>
+        </w:tc>
+        <w:tc>
+          <w:tcPr>
+            <w:tcW w:type="dxa" w:w="1920"/>
+            <w:vAlign w:val="center"/>
+          </w:tcPr>
+          <w:p>
+            <w:pPr>
+              <w:spacing w:after="0"/>
+            </w:pPr>
+            <w:r/>
+            <w:r>
+              <w:rPr>
+                <w:rFonts w:ascii="Aptos" w:hAnsi="Aptos"/>
+                <w:b w:val="0"/>
+                <w:sz w:val="16"/>
+              </w:rPr>
+              <w:t>0</w:t>
+            </w:r>
+          </w:p>
+        </w:tc>
+        <w:tc>
+          <w:tcPr>
+            <w:tcW w:type="dxa" w:w="1920"/>
+            <w:vAlign w:val="center"/>
+            <w:shd w:fill="E2F0D9"/>
+          </w:tcPr>
+          <w:p>
+            <w:pPr>
+              <w:spacing w:after="0"/>
+            </w:pPr>
+            <w:r/>
+            <w:r>
+              <w:rPr>
+                <w:rFonts w:ascii="Aptos" w:hAnsi="Aptos"/>
+                <w:b w:val="0"/>
+                <w:sz w:val="16"/>
+              </w:rPr>
+              <w:t>PASSOU</w:t>
+            </w:r>
+          </w:p>
+        </w:tc>
+        <w:tc>
+          <w:tcPr>
+            <w:tcW w:type="dxa" w:w="1920"/>
+            <w:vAlign w:val="center"/>
+          </w:tcPr>
+          <w:p>
+            <w:pPr>
+              <w:spacing w:after="0"/>
+            </w:pPr>
+            <w:r/>
+            <w:r>
+              <w:rPr>
+                <w:rFonts w:ascii="Aptos" w:hAnsi="Aptos"/>
+                <w:b w:val="0"/>
+                <w:sz w:val="16"/>
+              </w:rPr>
+              <w:t>Dockerfile, Compose e propriedades externas validados.</w:t>
+            </w:r>
+          </w:p>
+        </w:tc>
+      </w:tr>
+      <w:tr>
+        <w:tc>
+          <w:tcPr>
+            <w:tcW w:type="dxa" w:w="1920"/>
+            <w:vAlign w:val="center"/>
+          </w:tcPr>
+          <w:p>
+            <w:pPr>
+              <w:spacing w:after="0"/>
+            </w:pPr>
+            <w:r/>
+            <w:r>
+              <w:rPr>
+                <w:rFonts w:ascii="Aptos" w:hAnsi="Aptos"/>
+                <w:b w:val="0"/>
+                <w:sz w:val="16"/>
+              </w:rPr>
+              <w:t>8</w:t>
+            </w:r>
+          </w:p>
+        </w:tc>
+        <w:tc>
+          <w:tcPr>
+            <w:tcW w:type="dxa" w:w="1920"/>
+            <w:vAlign w:val="center"/>
+          </w:tcPr>
+          <w:p>
+            <w:pPr>
+              <w:spacing w:after="0"/>
+            </w:pPr>
+            <w:r/>
+            <w:r>
+              <w:rPr>
+                <w:rFonts w:ascii="Aptos" w:hAnsi="Aptos"/>
+                <w:b w:val="0"/>
+                <w:sz w:val="16"/>
+              </w:rPr>
+              <w:t>22:13:43</w:t>
+            </w:r>
+          </w:p>
+        </w:tc>
+        <w:tc>
+          <w:tcPr>
+            <w:tcW w:type="dxa" w:w="1920"/>
+            <w:vAlign w:val="center"/>
+          </w:tcPr>
+          <w:p>
+            <w:pPr>
+              <w:spacing w:after="0"/>
+            </w:pPr>
+            <w:r/>
+            <w:r>
+              <w:rPr>
+                <w:rFonts w:ascii="Aptos" w:hAnsi="Aptos"/>
+                <w:b w:val="0"/>
+                <w:sz w:val="16"/>
+              </w:rPr>
+              <w:t>Maven clean verify</w:t>
+            </w:r>
+          </w:p>
+        </w:tc>
+        <w:tc>
+          <w:tcPr>
+            <w:tcW w:type="dxa" w:w="1920"/>
+            <w:vAlign w:val="center"/>
+          </w:tcPr>
+          <w:p>
+            <w:pPr>
+              <w:spacing w:after="0"/>
+            </w:pPr>
+            <w:r/>
+            <w:r>
+              <w:rPr>
+                <w:rFonts w:ascii="Aptos" w:hAnsi="Aptos"/>
+                <w:b w:val="0"/>
+                <w:sz w:val="16"/>
+              </w:rPr>
+              <w:t>16</w:t>
+            </w:r>
+          </w:p>
+        </w:tc>
+        <w:tc>
+          <w:tcPr>
+            <w:tcW w:type="dxa" w:w="1920"/>
+            <w:vAlign w:val="center"/>
+          </w:tcPr>
+          <w:p>
+            <w:pPr>
+              <w:spacing w:after="0"/>
+            </w:pPr>
+            <w:r/>
+            <w:r>
+              <w:rPr>
+                <w:rFonts w:ascii="Aptos" w:hAnsi="Aptos"/>
+                <w:b w:val="0"/>
+                <w:sz w:val="16"/>
+              </w:rPr>
+              <w:t>16</w:t>
+            </w:r>
+          </w:p>
+        </w:tc>
+        <w:tc>
+          <w:tcPr>
+            <w:tcW w:type="dxa" w:w="1920"/>
+            <w:vAlign w:val="center"/>
+          </w:tcPr>
+          <w:p>
+            <w:pPr>
+              <w:spacing w:after="0"/>
+            </w:pPr>
+            <w:r/>
+            <w:r>
+              <w:rPr>
+                <w:rFonts w:ascii="Aptos" w:hAnsi="Aptos"/>
+                <w:b w:val="0"/>
+                <w:sz w:val="16"/>
+              </w:rPr>
+              <w:t>0</w:t>
+            </w:r>
+          </w:p>
+        </w:tc>
+        <w:tc>
+          <w:tcPr>
+            <w:tcW w:type="dxa" w:w="1920"/>
+            <w:vAlign w:val="center"/>
+            <w:shd w:fill="E2F0D9"/>
+          </w:tcPr>
+          <w:p>
+            <w:pPr>
+              <w:spacing w:after="0"/>
+            </w:pPr>
+            <w:r/>
+            <w:r>
+              <w:rPr>
+                <w:rFonts w:ascii="Aptos" w:hAnsi="Aptos"/>
+                <w:b w:val="0"/>
+                <w:sz w:val="16"/>
+              </w:rPr>
+              <w:t>PASSOU</w:t>
+            </w:r>
+          </w:p>
+        </w:tc>
+        <w:tc>
+          <w:tcPr>
+            <w:tcW w:type="dxa" w:w="1920"/>
+            <w:vAlign w:val="center"/>
+          </w:tcPr>
+          <w:p>
+            <w:pPr>
+              <w:spacing w:after="0"/>
+            </w:pPr>
+            <w:r/>
+            <w:r>
+              <w:rPr>
+                <w:rFonts w:ascii="Aptos" w:hAnsi="Aptos"/>
+                <w:b w:val="0"/>
+                <w:sz w:val="16"/>
+              </w:rPr>
+              <w:t>Suíte completa e JAR executável gerado com sucesso.</w:t>
             </w:r>
           </w:p>
         </w:tc>
@@ -3629,6 +3955,435 @@
           </w:p>
         </w:tc>
       </w:tr>
+      <w:tr>
+        <w:tc>
+          <w:tcPr>
+            <w:tcW w:type="dxa" w:w="2195"/>
+            <w:vAlign w:val="center"/>
+          </w:tcPr>
+          <w:p>
+            <w:pPr>
+              <w:spacing w:after="0"/>
+            </w:pPr>
+            <w:r/>
+            <w:r>
+              <w:rPr>
+                <w:rFonts w:ascii="Aptos" w:hAnsi="Aptos"/>
+                <w:b w:val="0"/>
+                <w:sz w:val="14"/>
+              </w:rPr>
+              <w:t>14</w:t>
+            </w:r>
+          </w:p>
+        </w:tc>
+        <w:tc>
+          <w:tcPr>
+            <w:tcW w:type="dxa" w:w="2195"/>
+            <w:vAlign w:val="center"/>
+          </w:tcPr>
+          <w:p>
+            <w:pPr>
+              <w:spacing w:after="0"/>
+            </w:pPr>
+            <w:r/>
+            <w:r>
+              <w:rPr>
+                <w:rFonts w:ascii="Aptos" w:hAnsi="Aptos"/>
+                <w:b w:val="0"/>
+                <w:sz w:val="14"/>
+              </w:rPr>
+              <w:t>DockerConfigurationTest.composeShouldDefineApplicationAndHealthyPostgresDependency</w:t>
+            </w:r>
+          </w:p>
+        </w:tc>
+        <w:tc>
+          <w:tcPr>
+            <w:tcW w:type="dxa" w:w="2195"/>
+            <w:vAlign w:val="center"/>
+          </w:tcPr>
+          <w:p>
+            <w:pPr>
+              <w:spacing w:after="0"/>
+            </w:pPr>
+            <w:r/>
+            <w:r>
+              <w:rPr>
+                <w:rFonts w:ascii="Aptos" w:hAnsi="Aptos"/>
+                <w:b w:val="0"/>
+                <w:sz w:val="14"/>
+              </w:rPr>
+              <w:t>Parse do compose.yaml e validação dos serviços app/postgres, healthcheck, volume e conexão JDBC.</w:t>
+            </w:r>
+          </w:p>
+        </w:tc>
+        <w:tc>
+          <w:tcPr>
+            <w:tcW w:type="dxa" w:w="2195"/>
+            <w:vAlign w:val="center"/>
+          </w:tcPr>
+          <w:p>
+            <w:pPr>
+              <w:spacing w:after="0"/>
+            </w:pPr>
+            <w:r/>
+            <w:r>
+              <w:rPr>
+                <w:rFonts w:ascii="Aptos" w:hAnsi="Aptos"/>
+                <w:b w:val="0"/>
+                <w:sz w:val="14"/>
+              </w:rPr>
+              <w:t>YAML válido; PostgreSQL saudável antes da aplicação; volume persistente e hostname interno corretos.</w:t>
+            </w:r>
+          </w:p>
+        </w:tc>
+        <w:tc>
+          <w:tcPr>
+            <w:tcW w:type="dxa" w:w="2195"/>
+            <w:vAlign w:val="center"/>
+          </w:tcPr>
+          <w:p>
+            <w:pPr>
+              <w:spacing w:after="0"/>
+            </w:pPr>
+            <w:r/>
+            <w:r>
+              <w:rPr>
+                <w:rFonts w:ascii="Aptos" w:hAnsi="Aptos"/>
+                <w:b w:val="0"/>
+                <w:sz w:val="14"/>
+              </w:rPr>
+              <w:t>SnakeYAML carregou o arquivo e todas as propriedades esperadas foram encontradas.</w:t>
+            </w:r>
+          </w:p>
+        </w:tc>
+        <w:tc>
+          <w:tcPr>
+            <w:tcW w:type="dxa" w:w="2195"/>
+            <w:vAlign w:val="center"/>
+            <w:shd w:fill="E2F0D9"/>
+          </w:tcPr>
+          <w:p>
+            <w:pPr>
+              <w:spacing w:after="0"/>
+            </w:pPr>
+            <w:r/>
+            <w:r>
+              <w:rPr>
+                <w:rFonts w:ascii="Aptos" w:hAnsi="Aptos"/>
+                <w:b w:val="0"/>
+                <w:sz w:val="14"/>
+              </w:rPr>
+              <w:t>SIM — PASSOU</w:t>
+            </w:r>
+          </w:p>
+        </w:tc>
+        <w:tc>
+          <w:tcPr>
+            <w:tcW w:type="dxa" w:w="2195"/>
+            <w:vAlign w:val="center"/>
+          </w:tcPr>
+          <w:p>
+            <w:pPr>
+              <w:spacing w:after="0"/>
+            </w:pPr>
+            <w:r/>
+            <w:r>
+              <w:rPr>
+                <w:rFonts w:ascii="Aptos" w:hAnsi="Aptos"/>
+                <w:b w:val="0"/>
+                <w:sz w:val="14"/>
+              </w:rPr>
+              <w:t>Criado compose.yaml com PostgreSQL 18.6, pg_isready, service_healthy e volume nomeado.</w:t>
+            </w:r>
+          </w:p>
+        </w:tc>
+      </w:tr>
+      <w:tr>
+        <w:tc>
+          <w:tcPr>
+            <w:tcW w:type="dxa" w:w="2195"/>
+            <w:vAlign w:val="center"/>
+          </w:tcPr>
+          <w:p>
+            <w:pPr>
+              <w:spacing w:after="0"/>
+            </w:pPr>
+            <w:r/>
+            <w:r>
+              <w:rPr>
+                <w:rFonts w:ascii="Aptos" w:hAnsi="Aptos"/>
+                <w:b w:val="0"/>
+                <w:sz w:val="14"/>
+              </w:rPr>
+              <w:t>15</w:t>
+            </w:r>
+          </w:p>
+        </w:tc>
+        <w:tc>
+          <w:tcPr>
+            <w:tcW w:type="dxa" w:w="2195"/>
+            <w:vAlign w:val="center"/>
+          </w:tcPr>
+          <w:p>
+            <w:pPr>
+              <w:spacing w:after="0"/>
+            </w:pPr>
+            <w:r/>
+            <w:r>
+              <w:rPr>
+                <w:rFonts w:ascii="Aptos" w:hAnsi="Aptos"/>
+                <w:b w:val="0"/>
+                <w:sz w:val="14"/>
+              </w:rPr>
+              <w:t>DockerConfigurationTest.dockerfileShouldUseJava21MultiStageBuildAndNonRootRuntime</w:t>
+            </w:r>
+          </w:p>
+        </w:tc>
+        <w:tc>
+          <w:tcPr>
+            <w:tcW w:type="dxa" w:w="2195"/>
+            <w:vAlign w:val="center"/>
+          </w:tcPr>
+          <w:p>
+            <w:pPr>
+              <w:spacing w:after="0"/>
+            </w:pPr>
+            <w:r/>
+            <w:r>
+              <w:rPr>
+                <w:rFonts w:ascii="Aptos" w:hAnsi="Aptos"/>
+                <w:b w:val="0"/>
+                <w:sz w:val="14"/>
+              </w:rPr>
+              <w:t>Validação do contrato de build e runtime da imagem da aplicação.</w:t>
+            </w:r>
+          </w:p>
+        </w:tc>
+        <w:tc>
+          <w:tcPr>
+            <w:tcW w:type="dxa" w:w="2195"/>
+            <w:vAlign w:val="center"/>
+          </w:tcPr>
+          <w:p>
+            <w:pPr>
+              <w:spacing w:after="0"/>
+            </w:pPr>
+            <w:r/>
+            <w:r>
+              <w:rPr>
+                <w:rFonts w:ascii="Aptos" w:hAnsi="Aptos"/>
+                <w:b w:val="0"/>
+                <w:sz w:val="14"/>
+              </w:rPr>
+              <w:t>Build Maven/Java 21 separado do runtime JRE 21; processo executado por usuário não-root.</w:t>
+            </w:r>
+          </w:p>
+        </w:tc>
+        <w:tc>
+          <w:tcPr>
+            <w:tcW w:type="dxa" w:w="2195"/>
+            <w:vAlign w:val="center"/>
+          </w:tcPr>
+          <w:p>
+            <w:pPr>
+              <w:spacing w:after="0"/>
+            </w:pPr>
+            <w:r/>
+            <w:r>
+              <w:rPr>
+                <w:rFonts w:ascii="Aptos" w:hAnsi="Aptos"/>
+                <w:b w:val="0"/>
+                <w:sz w:val="14"/>
+              </w:rPr>
+              <w:t>Multi-stage, COPY --from=build, USER ledgercore, porta 8080 e ENTRYPOINT confirmados.</w:t>
+            </w:r>
+          </w:p>
+        </w:tc>
+        <w:tc>
+          <w:tcPr>
+            <w:tcW w:type="dxa" w:w="2195"/>
+            <w:vAlign w:val="center"/>
+            <w:shd w:fill="E2F0D9"/>
+          </w:tcPr>
+          <w:p>
+            <w:pPr>
+              <w:spacing w:after="0"/>
+            </w:pPr>
+            <w:r/>
+            <w:r>
+              <w:rPr>
+                <w:rFonts w:ascii="Aptos" w:hAnsi="Aptos"/>
+                <w:b w:val="0"/>
+                <w:sz w:val="14"/>
+              </w:rPr>
+              <w:t>SIM — PASSOU</w:t>
+            </w:r>
+          </w:p>
+        </w:tc>
+        <w:tc>
+          <w:tcPr>
+            <w:tcW w:type="dxa" w:w="2195"/>
+            <w:vAlign w:val="center"/>
+          </w:tcPr>
+          <w:p>
+            <w:pPr>
+              <w:spacing w:after="0"/>
+            </w:pPr>
+            <w:r/>
+            <w:r>
+              <w:rPr>
+                <w:rFonts w:ascii="Aptos" w:hAnsi="Aptos"/>
+                <w:b w:val="0"/>
+                <w:sz w:val="14"/>
+              </w:rPr>
+              <w:t>Criado Dockerfile multi-stage com Maven 3.9.16 e Eclipse Temurin 21.</w:t>
+            </w:r>
+          </w:p>
+        </w:tc>
+      </w:tr>
+      <w:tr>
+        <w:tc>
+          <w:tcPr>
+            <w:tcW w:type="dxa" w:w="2195"/>
+            <w:vAlign w:val="center"/>
+          </w:tcPr>
+          <w:p>
+            <w:pPr>
+              <w:spacing w:after="0"/>
+            </w:pPr>
+            <w:r/>
+            <w:r>
+              <w:rPr>
+                <w:rFonts w:ascii="Aptos" w:hAnsi="Aptos"/>
+                <w:b w:val="0"/>
+                <w:sz w:val="14"/>
+              </w:rPr>
+              <w:t>16</w:t>
+            </w:r>
+          </w:p>
+        </w:tc>
+        <w:tc>
+          <w:tcPr>
+            <w:tcW w:type="dxa" w:w="2195"/>
+            <w:vAlign w:val="center"/>
+          </w:tcPr>
+          <w:p>
+            <w:pPr>
+              <w:spacing w:after="0"/>
+            </w:pPr>
+            <w:r/>
+            <w:r>
+              <w:rPr>
+                <w:rFonts w:ascii="Aptos" w:hAnsi="Aptos"/>
+                <w:b w:val="0"/>
+                <w:sz w:val="14"/>
+              </w:rPr>
+              <w:t>DockerConfigurationTest.applicationConfigurationShouldUseExternalizedRuntimeProperties</w:t>
+            </w:r>
+          </w:p>
+        </w:tc>
+        <w:tc>
+          <w:tcPr>
+            <w:tcW w:type="dxa" w:w="2195"/>
+            <w:vAlign w:val="center"/>
+          </w:tcPr>
+          <w:p>
+            <w:pPr>
+              <w:spacing w:after="0"/>
+            </w:pPr>
+            <w:r/>
+            <w:r>
+              <w:rPr>
+                <w:rFonts w:ascii="Aptos" w:hAnsi="Aptos"/>
+                <w:b w:val="0"/>
+                <w:sz w:val="14"/>
+              </w:rPr>
+              <w:t>Validação das variáveis de datasource/JWT e do arquivo .env.example.</w:t>
+            </w:r>
+          </w:p>
+        </w:tc>
+        <w:tc>
+          <w:tcPr>
+            <w:tcW w:type="dxa" w:w="2195"/>
+            <w:vAlign w:val="center"/>
+          </w:tcPr>
+          <w:p>
+            <w:pPr>
+              <w:spacing w:after="0"/>
+            </w:pPr>
+            <w:r/>
+            <w:r>
+              <w:rPr>
+                <w:rFonts w:ascii="Aptos" w:hAnsi="Aptos"/>
+                <w:b w:val="0"/>
+                <w:sz w:val="14"/>
+              </w:rPr>
+              <w:t>Credenciais e chave JWT configuráveis fora do código; exemplo versionável disponível.</w:t>
+            </w:r>
+          </w:p>
+        </w:tc>
+        <w:tc>
+          <w:tcPr>
+            <w:tcW w:type="dxa" w:w="2195"/>
+            <w:vAlign w:val="center"/>
+          </w:tcPr>
+          <w:p>
+            <w:pPr>
+              <w:spacing w:after="0"/>
+            </w:pPr>
+            <w:r/>
+            <w:r>
+              <w:rPr>
+                <w:rFonts w:ascii="Aptos" w:hAnsi="Aptos"/>
+                <w:b w:val="0"/>
+                <w:sz w:val="14"/>
+              </w:rPr>
+              <w:t>Placeholders Spring e variáveis POSTGRES_PASSWORD/JWT_KEY confirmados.</w:t>
+            </w:r>
+          </w:p>
+        </w:tc>
+        <w:tc>
+          <w:tcPr>
+            <w:tcW w:type="dxa" w:w="2195"/>
+            <w:vAlign w:val="center"/>
+            <w:shd w:fill="E2F0D9"/>
+          </w:tcPr>
+          <w:p>
+            <w:pPr>
+              <w:spacing w:after="0"/>
+            </w:pPr>
+            <w:r/>
+            <w:r>
+              <w:rPr>
+                <w:rFonts w:ascii="Aptos" w:hAnsi="Aptos"/>
+                <w:b w:val="0"/>
+                <w:sz w:val="14"/>
+              </w:rPr>
+              <w:t>SIM — PASSOU</w:t>
+            </w:r>
+          </w:p>
+        </w:tc>
+        <w:tc>
+          <w:tcPr>
+            <w:tcW w:type="dxa" w:w="2195"/>
+            <w:vAlign w:val="center"/>
+          </w:tcPr>
+          <w:p>
+            <w:pPr>
+              <w:spacing w:after="0"/>
+            </w:pPr>
+            <w:r/>
+            <w:r>
+              <w:rPr>
+                <w:rFonts w:ascii="Aptos" w:hAnsi="Aptos"/>
+                <w:b w:val="0"/>
+                <w:sz w:val="14"/>
+              </w:rPr>
+              <w:t>application.yaml externalizado; .env ignorado pelo Git; H2 isolado em src/test/resources.</w:t>
+            </w:r>
+          </w:p>
+        </w:tc>
+      </w:tr>
     </w:tbl>
     <w:p>
       <w:pPr>
@@ -3921,6 +4676,72 @@
           </w:p>
         </w:tc>
       </w:tr>
+      <w:tr>
+        <w:trPr>
+          <w:cantSplit/>
+        </w:trPr>
+        <w:tc>
+          <w:tcPr>
+            <w:tcW w:type="dxa" w:w="3118"/>
+            <w:vAlign w:val="center"/>
+          </w:tcPr>
+          <w:p>
+            <w:pPr>
+              <w:spacing w:after="0"/>
+            </w:pPr>
+            <w:r/>
+            <w:r>
+              <w:rPr>
+                <w:rFonts w:ascii="Aptos" w:hAnsi="Aptos"/>
+                <w:b w:val="0"/>
+                <w:sz w:val="16"/>
+              </w:rPr>
+              <w:t>Dockerfile, compose.yaml e configuração</w:t>
+            </w:r>
+          </w:p>
+        </w:tc>
+        <w:tc>
+          <w:tcPr>
+            <w:tcW w:type="dxa" w:w="5102"/>
+            <w:vAlign w:val="center"/>
+          </w:tcPr>
+          <w:p>
+            <w:pPr>
+              <w:spacing w:after="0"/>
+            </w:pPr>
+            <w:r/>
+            <w:r>
+              <w:rPr>
+                <w:rFonts w:ascii="Aptos" w:hAnsi="Aptos"/>
+                <w:b w:val="0"/>
+                <w:sz w:val="16"/>
+              </w:rPr>
+              <w:t>O projeto não possuía ambiente reproduzível para executar a aplicação com PostgreSQL.</w:t>
+            </w:r>
+          </w:p>
+        </w:tc>
+        <w:tc>
+          <w:tcPr>
+            <w:tcW w:type="dxa" w:w="7087"/>
+            <w:vAlign w:val="center"/>
+            <w:shd w:fill="E2F0D9"/>
+          </w:tcPr>
+          <w:p>
+            <w:pPr>
+              <w:spacing w:after="0"/>
+            </w:pPr>
+            <w:r/>
+            <w:r>
+              <w:rPr>
+                <w:rFonts w:ascii="Aptos" w:hAnsi="Aptos"/>
+                <w:b w:val="0"/>
+                <w:sz w:val="16"/>
+              </w:rPr>
+              <w:t>Adicionados build multi-stage, PostgreSQL saudável/persistente, variáveis externas, H2 de teste e documentação de operação.</w:t>
+            </w:r>
+          </w:p>
+        </w:tc>
+      </w:tr>
     </w:tbl>
     <w:p>
       <w:pPr>
@@ -3982,7 +4803,7 @@
         <w:t xml:space="preserve">Conclusão: </w:t>
       </w:r>
       <w:r>
-        <w:t>a suíte atual está verde; os relacionamentos User–Account e Account–Entry usam uma única FK e estão protegidos por testes de regressão.</w:t>
+        <w:t>a suíte atual está verde e o projeto está preparado para Docker Compose com PostgreSQL. O ambiente usado nesta execução não possui Docker instalado; por isso, a subida real dos contêineres deve ser confirmada com docker compose up --build em uma máquina com Docker Engine.</w:t>
       </w:r>
     </w:p>
     <w:sectPr>

</xml_diff>

<commit_message>
feat(account): adds account routes
</commit_message>
<xml_diff>
--- a/docs/Historico_de_Testes_LedgerCore.docx
+++ b/docs/Historico_de_Testes_LedgerCore.docx
@@ -119,7 +119,7 @@
                 <w:b w:val="0"/>
                 <w:sz w:val="18"/>
               </w:rPr>
-              <w:t>14/10/2026 — 22:13 (America/Sao_Paulo)</w:t>
+              <w:t>14/10/2026 — 22:23 (America/Sao_Paulo)</w:t>
             </w:r>
           </w:p>
         </w:tc>
@@ -165,7 +165,7 @@
                 <w:b w:val="0"/>
                 <w:sz w:val="18"/>
               </w:rPr>
-              <w:t>Feat/Auth / d4c150a</w:t>
+              <w:t>main / 5100b33</w:t>
             </w:r>
           </w:p>
         </w:tc>
@@ -206,7 +206,7 @@
                 <w:b w:val="0"/>
                 <w:sz w:val="18"/>
               </w:rPr>
-              <w:t>mvn test</w:t>
+              <w:t>mvn clean verify</w:t>
             </w:r>
           </w:p>
         </w:tc>
@@ -1904,6 +1904,169 @@
                 <w:sz w:val="16"/>
               </w:rPr>
               <w:t>Suíte completa e JAR executável gerado com sucesso.</w:t>
+            </w:r>
+          </w:p>
+        </w:tc>
+      </w:tr>
+      <w:tr>
+        <w:tc>
+          <w:tcPr>
+            <w:tcW w:type="dxa" w:w="1920"/>
+            <w:vAlign w:val="center"/>
+          </w:tcPr>
+          <w:p>
+            <w:pPr>
+              <w:spacing w:after="0"/>
+            </w:pPr>
+            <w:r/>
+            <w:r>
+              <w:rPr>
+                <w:rFonts w:ascii="Aptos" w:hAnsi="Aptos"/>
+                <w:b w:val="0"/>
+                <w:sz w:val="16"/>
+              </w:rPr>
+              <w:t>9</w:t>
+            </w:r>
+          </w:p>
+        </w:tc>
+        <w:tc>
+          <w:tcPr>
+            <w:tcW w:type="dxa" w:w="1920"/>
+            <w:vAlign w:val="center"/>
+          </w:tcPr>
+          <w:p>
+            <w:pPr>
+              <w:spacing w:after="0"/>
+            </w:pPr>
+            <w:r/>
+            <w:r>
+              <w:rPr>
+                <w:rFonts w:ascii="Aptos" w:hAnsi="Aptos"/>
+                <w:b w:val="0"/>
+                <w:sz w:val="16"/>
+              </w:rPr>
+              <w:t>22:23:02</w:t>
+            </w:r>
+          </w:p>
+        </w:tc>
+        <w:tc>
+          <w:tcPr>
+            <w:tcW w:type="dxa" w:w="1920"/>
+            <w:vAlign w:val="center"/>
+          </w:tcPr>
+          <w:p>
+            <w:pPr>
+              <w:spacing w:after="0"/>
+            </w:pPr>
+            <w:r/>
+            <w:r>
+              <w:rPr>
+                <w:rFonts w:ascii="Aptos" w:hAnsi="Aptos"/>
+                <w:b w:val="0"/>
+                <w:sz w:val="16"/>
+              </w:rPr>
+              <w:t>Revalidação após pull da main</w:t>
+            </w:r>
+          </w:p>
+        </w:tc>
+        <w:tc>
+          <w:tcPr>
+            <w:tcW w:type="dxa" w:w="1920"/>
+            <w:vAlign w:val="center"/>
+          </w:tcPr>
+          <w:p>
+            <w:pPr>
+              <w:spacing w:after="0"/>
+            </w:pPr>
+            <w:r/>
+            <w:r>
+              <w:rPr>
+                <w:rFonts w:ascii="Aptos" w:hAnsi="Aptos"/>
+                <w:b w:val="0"/>
+                <w:sz w:val="16"/>
+              </w:rPr>
+              <w:t>16</w:t>
+            </w:r>
+          </w:p>
+        </w:tc>
+        <w:tc>
+          <w:tcPr>
+            <w:tcW w:type="dxa" w:w="1920"/>
+            <w:vAlign w:val="center"/>
+          </w:tcPr>
+          <w:p>
+            <w:pPr>
+              <w:spacing w:after="0"/>
+            </w:pPr>
+            <w:r/>
+            <w:r>
+              <w:rPr>
+                <w:rFonts w:ascii="Aptos" w:hAnsi="Aptos"/>
+                <w:b w:val="0"/>
+                <w:sz w:val="16"/>
+              </w:rPr>
+              <w:t>16</w:t>
+            </w:r>
+          </w:p>
+        </w:tc>
+        <w:tc>
+          <w:tcPr>
+            <w:tcW w:type="dxa" w:w="1920"/>
+            <w:vAlign w:val="center"/>
+          </w:tcPr>
+          <w:p>
+            <w:pPr>
+              <w:spacing w:after="0"/>
+            </w:pPr>
+            <w:r/>
+            <w:r>
+              <w:rPr>
+                <w:rFonts w:ascii="Aptos" w:hAnsi="Aptos"/>
+                <w:b w:val="0"/>
+                <w:sz w:val="16"/>
+              </w:rPr>
+              <w:t>0</w:t>
+            </w:r>
+          </w:p>
+        </w:tc>
+        <w:tc>
+          <w:tcPr>
+            <w:tcW w:type="dxa" w:w="1920"/>
+            <w:vAlign w:val="center"/>
+            <w:shd w:fill="E2F0D9"/>
+          </w:tcPr>
+          <w:p>
+            <w:pPr>
+              <w:spacing w:after="0"/>
+            </w:pPr>
+            <w:r/>
+            <w:r>
+              <w:rPr>
+                <w:rFonts w:ascii="Aptos" w:hAnsi="Aptos"/>
+                <w:b w:val="0"/>
+                <w:sz w:val="16"/>
+              </w:rPr>
+              <w:t>PASSOU</w:t>
+            </w:r>
+          </w:p>
+        </w:tc>
+        <w:tc>
+          <w:tcPr>
+            <w:tcW w:type="dxa" w:w="1920"/>
+            <w:vAlign w:val="center"/>
+          </w:tcPr>
+          <w:p>
+            <w:pPr>
+              <w:spacing w:after="0"/>
+            </w:pPr>
+            <w:r/>
+            <w:r>
+              <w:rPr>
+                <w:rFonts w:ascii="Aptos" w:hAnsi="Aptos"/>
+                <w:b w:val="0"/>
+                <w:sz w:val="16"/>
+              </w:rPr>
+              <w:t>Arquivo .env local restaurado; configuração Docker versionada permaneceu íntegra e o JAR foi gerado.</w:t>
             </w:r>
           </w:p>
         </w:tc>
@@ -4742,6 +4905,72 @@
           </w:p>
         </w:tc>
       </w:tr>
+      <w:tr>
+        <w:trPr>
+          <w:cantSplit/>
+        </w:trPr>
+        <w:tc>
+          <w:tcPr>
+            <w:tcW w:type="dxa" w:w="3118"/>
+            <w:vAlign w:val="center"/>
+          </w:tcPr>
+          <w:p>
+            <w:pPr>
+              <w:spacing w:after="0"/>
+            </w:pPr>
+            <w:r/>
+            <w:r>
+              <w:rPr>
+                <w:rFonts w:ascii="Aptos" w:hAnsi="Aptos"/>
+                <w:b w:val="0"/>
+                <w:sz w:val="16"/>
+              </w:rPr>
+              <w:t>.env — configuração local após pull</w:t>
+            </w:r>
+          </w:p>
+        </w:tc>
+        <w:tc>
+          <w:tcPr>
+            <w:tcW w:type="dxa" w:w="5102"/>
+            <w:vAlign w:val="center"/>
+          </w:tcPr>
+          <w:p>
+            <w:pPr>
+              <w:spacing w:after="0"/>
+            </w:pPr>
+            <w:r/>
+            <w:r>
+              <w:rPr>
+                <w:rFonts w:ascii="Aptos" w:hAnsi="Aptos"/>
+                <w:b w:val="0"/>
+                <w:sz w:val="16"/>
+              </w:rPr>
+              <w:t>O arquivo local não existia após atualizar a branch, pois credenciais .env são intencionalmente ignoradas pelo Git.</w:t>
+            </w:r>
+          </w:p>
+        </w:tc>
+        <w:tc>
+          <w:tcPr>
+            <w:tcW w:type="dxa" w:w="7087"/>
+            <w:vAlign w:val="center"/>
+            <w:shd w:fill="E2F0D9"/>
+          </w:tcPr>
+          <w:p>
+            <w:pPr>
+              <w:spacing w:after="0"/>
+            </w:pPr>
+            <w:r/>
+            <w:r>
+              <w:rPr>
+                <w:rFonts w:ascii="Aptos" w:hAnsi="Aptos"/>
+                <w:b w:val="0"/>
+                <w:sz w:val="16"/>
+              </w:rPr>
+              <w:t>Restaurado a partir do contrato de .env.example; API e PostgreSQL voltaram a compartilhar banco, usuário e senha de desenvolvimento.</w:t>
+            </w:r>
+          </w:p>
+        </w:tc>
+      </w:tr>
     </w:tbl>
     <w:p>
       <w:pPr>

</xml_diff>

<commit_message>
feat(account): Tests performed and documented
</commit_message>
<xml_diff>
--- a/docs/Historico_de_Testes_LedgerCore.docx
+++ b/docs/Historico_de_Testes_LedgerCore.docx
@@ -119,7 +119,7 @@
                 <w:b w:val="0"/>
                 <w:sz w:val="18"/>
               </w:rPr>
-              <w:t>14/10/2026 — 22:23 (America/Sao_Paulo)</w:t>
+              <w:t>15/10/2026 — 20:35 (America/Sao_Paulo)</w:t>
             </w:r>
           </w:p>
         </w:tc>
@@ -165,7 +165,7 @@
                 <w:b w:val="0"/>
                 <w:sz w:val="18"/>
               </w:rPr>
-              <w:t>main / 5100b33</w:t>
+              <w:t>Feat/Account / 248c0d9</w:t>
             </w:r>
           </w:p>
         </w:tc>
@@ -282,6 +282,7 @@
             <w:tcW w:type="dxa" w:w="5102"/>
             <w:vAlign w:val="center"/>
             <w:shd w:fill="E2F0D9"/>
+            <w:shd w:fill="E2F0D9"/>
           </w:tcPr>
           <w:p>
             <w:pPr>
@@ -329,6 +330,7 @@
             <w:tcW w:type="dxa" w:w="5102"/>
             <w:vAlign w:val="center"/>
             <w:shd w:fill="E2F0D9"/>
+            <w:shd w:fill="E2F0D9"/>
           </w:tcPr>
           <w:p>
             <w:pPr>
@@ -341,7 +343,7 @@
                 <w:b/>
                 <w:sz w:val="18"/>
               </w:rPr>
-              <w:t>16 executados • 16 aprovados</w:t>
+              <w:t>18 executados • 18 aprovados</w:t>
             </w:r>
           </w:p>
         </w:tc>
@@ -5035,6 +5037,1680 @@
         <w:t>a suíte atual está verde e o projeto está preparado para Docker Compose com PostgreSQL. O ambiente usado nesta execução não possui Docker instalado; por isso, a subida real dos contêineres deve ser confirmada com docker compose up --build em uma máquina com Docker Engine.</w:t>
       </w:r>
     </w:p>
+    <w:p>
+      <w:r>
+        <w:br w:type="page"/>
+      </w:r>
+    </w:p>
+    <w:p>
+      <w:pPr>
+        <w:pStyle w:val="Heading1"/>
+        <w:spacing w:after="80"/>
+      </w:pPr>
+      <w:r>
+        <w:t>5. AccountController — execução de 15/10/2026</w:t>
+      </w:r>
+    </w:p>
+    <w:p>
+      <w:pPr>
+        <w:spacing w:after="100"/>
+      </w:pPr>
+      <w:r>
+        <w:t>Foram documentados e implementados dois cenários unitários para o endpoint GET /v1/account. Os testes seguem o padrão standalone do Spring MockMvc com AccountService e Authentication mockados pelo Mockito.</w:t>
+      </w:r>
+    </w:p>
+    <w:p>
+      <w:pPr>
+        <w:pStyle w:val="Heading2"/>
+      </w:pPr>
+      <w:r>
+        <w:t>5.1 Execuções realizadas</w:t>
+      </w:r>
+    </w:p>
+    <w:tbl>
+      <w:tblPr>
+        <w:tblStyle w:val="TableGrid"/>
+        <w:tblW w:type="auto" w:w="0"/>
+        <w:jc w:val="center"/>
+        <w:tblLook w:firstColumn="1" w:firstRow="1" w:lastColumn="0" w:lastRow="0" w:noHBand="0" w:noVBand="1" w:val="04A0"/>
+      </w:tblPr>
+      <w:tblGrid>
+        <w:gridCol w:w="1707"/>
+        <w:gridCol w:w="1707"/>
+        <w:gridCol w:w="1707"/>
+        <w:gridCol w:w="1707"/>
+        <w:gridCol w:w="1707"/>
+        <w:gridCol w:w="1707"/>
+        <w:gridCol w:w="1707"/>
+        <w:gridCol w:w="1707"/>
+        <w:gridCol w:w="1707"/>
+      </w:tblGrid>
+      <w:tr>
+        <w:tc>
+          <w:tcPr>
+            <w:tcW w:type="dxa" w:w="1707"/>
+            <w:vAlign w:val="center"/>
+            <w:shd w:fill="1F4E79"/>
+          </w:tcPr>
+          <w:p>
+            <w:pPr>
+              <w:spacing w:after="0"/>
+            </w:pPr>
+            <w:r/>
+            <w:r>
+              <w:rPr>
+                <w:rFonts w:ascii="Aptos" w:hAnsi="Aptos"/>
+                <w:b/>
+                <w:color w:val="FFFFFF"/>
+                <w:sz w:val="14"/>
+              </w:rPr>
+              <w:t>#</w:t>
+            </w:r>
+          </w:p>
+        </w:tc>
+        <w:tc>
+          <w:tcPr>
+            <w:tcW w:type="dxa" w:w="1707"/>
+            <w:vAlign w:val="center"/>
+            <w:shd w:fill="1F4E79"/>
+          </w:tcPr>
+          <w:p>
+            <w:pPr>
+              <w:spacing w:after="0"/>
+            </w:pPr>
+            <w:r/>
+            <w:r>
+              <w:rPr>
+                <w:rFonts w:ascii="Aptos" w:hAnsi="Aptos"/>
+                <w:b/>
+                <w:color w:val="FFFFFF"/>
+                <w:sz w:val="14"/>
+              </w:rPr>
+              <w:t>Horário</w:t>
+            </w:r>
+          </w:p>
+        </w:tc>
+        <w:tc>
+          <w:tcPr>
+            <w:tcW w:type="dxa" w:w="1707"/>
+            <w:vAlign w:val="center"/>
+            <w:shd w:fill="1F4E79"/>
+          </w:tcPr>
+          <w:p>
+            <w:pPr>
+              <w:spacing w:after="0"/>
+            </w:pPr>
+            <w:r/>
+            <w:r>
+              <w:rPr>
+                <w:rFonts w:ascii="Aptos" w:hAnsi="Aptos"/>
+                <w:b/>
+                <w:color w:val="FFFFFF"/>
+                <w:sz w:val="14"/>
+              </w:rPr>
+              <w:t>Escopo</w:t>
+            </w:r>
+          </w:p>
+        </w:tc>
+        <w:tc>
+          <w:tcPr>
+            <w:tcW w:type="dxa" w:w="1707"/>
+            <w:vAlign w:val="center"/>
+            <w:shd w:fill="1F4E79"/>
+          </w:tcPr>
+          <w:p>
+            <w:pPr>
+              <w:spacing w:after="0"/>
+            </w:pPr>
+            <w:r/>
+            <w:r>
+              <w:rPr>
+                <w:rFonts w:ascii="Aptos" w:hAnsi="Aptos"/>
+                <w:b/>
+                <w:color w:val="FFFFFF"/>
+                <w:sz w:val="14"/>
+              </w:rPr>
+              <w:t>Executados</w:t>
+            </w:r>
+          </w:p>
+        </w:tc>
+        <w:tc>
+          <w:tcPr>
+            <w:tcW w:type="dxa" w:w="1707"/>
+            <w:vAlign w:val="center"/>
+            <w:shd w:fill="1F4E79"/>
+          </w:tcPr>
+          <w:p>
+            <w:pPr>
+              <w:spacing w:after="0"/>
+            </w:pPr>
+            <w:r/>
+            <w:r>
+              <w:rPr>
+                <w:rFonts w:ascii="Aptos" w:hAnsi="Aptos"/>
+                <w:b/>
+                <w:color w:val="FFFFFF"/>
+                <w:sz w:val="14"/>
+              </w:rPr>
+              <w:t>Aprovados</w:t>
+            </w:r>
+          </w:p>
+        </w:tc>
+        <w:tc>
+          <w:tcPr>
+            <w:tcW w:type="dxa" w:w="1707"/>
+            <w:vAlign w:val="center"/>
+            <w:shd w:fill="1F4E79"/>
+          </w:tcPr>
+          <w:p>
+            <w:pPr>
+              <w:spacing w:after="0"/>
+            </w:pPr>
+            <w:r/>
+            <w:r>
+              <w:rPr>
+                <w:rFonts w:ascii="Aptos" w:hAnsi="Aptos"/>
+                <w:b/>
+                <w:color w:val="FFFFFF"/>
+                <w:sz w:val="14"/>
+              </w:rPr>
+              <w:t>Falhas</w:t>
+            </w:r>
+          </w:p>
+        </w:tc>
+        <w:tc>
+          <w:tcPr>
+            <w:tcW w:type="dxa" w:w="1707"/>
+            <w:vAlign w:val="center"/>
+            <w:shd w:fill="1F4E79"/>
+          </w:tcPr>
+          <w:p>
+            <w:pPr>
+              <w:spacing w:after="0"/>
+            </w:pPr>
+            <w:r/>
+            <w:r>
+              <w:rPr>
+                <w:rFonts w:ascii="Aptos" w:hAnsi="Aptos"/>
+                <w:b/>
+                <w:color w:val="FFFFFF"/>
+                <w:sz w:val="14"/>
+              </w:rPr>
+              <w:t>Erros</w:t>
+            </w:r>
+          </w:p>
+        </w:tc>
+        <w:tc>
+          <w:tcPr>
+            <w:tcW w:type="dxa" w:w="1707"/>
+            <w:vAlign w:val="center"/>
+            <w:shd w:fill="1F4E79"/>
+          </w:tcPr>
+          <w:p>
+            <w:pPr>
+              <w:spacing w:after="0"/>
+            </w:pPr>
+            <w:r/>
+            <w:r>
+              <w:rPr>
+                <w:rFonts w:ascii="Aptos" w:hAnsi="Aptos"/>
+                <w:b/>
+                <w:color w:val="FFFFFF"/>
+                <w:sz w:val="14"/>
+              </w:rPr>
+              <w:t>Status</w:t>
+            </w:r>
+          </w:p>
+        </w:tc>
+        <w:tc>
+          <w:tcPr>
+            <w:tcW w:type="dxa" w:w="1707"/>
+            <w:vAlign w:val="center"/>
+            <w:shd w:fill="1F4E79"/>
+          </w:tcPr>
+          <w:p>
+            <w:pPr>
+              <w:spacing w:after="0"/>
+            </w:pPr>
+            <w:r/>
+            <w:r>
+              <w:rPr>
+                <w:rFonts w:ascii="Aptos" w:hAnsi="Aptos"/>
+                <w:b/>
+                <w:color w:val="FFFFFF"/>
+                <w:sz w:val="14"/>
+              </w:rPr>
+              <w:t>Observação</w:t>
+            </w:r>
+          </w:p>
+        </w:tc>
+      </w:tr>
+      <w:tr>
+        <w:trPr>
+          <w:cantSplit/>
+        </w:trPr>
+        <w:tc>
+          <w:tcPr>
+            <w:tcW w:type="dxa" w:w="1707"/>
+            <w:vAlign w:val="center"/>
+          </w:tcPr>
+          <w:p>
+            <w:pPr>
+              <w:spacing w:after="0"/>
+            </w:pPr>
+            <w:r/>
+            <w:r>
+              <w:rPr>
+                <w:rFonts w:ascii="Aptos" w:hAnsi="Aptos"/>
+                <w:b w:val="0"/>
+                <w:sz w:val="14"/>
+              </w:rPr>
+              <w:t>1</w:t>
+            </w:r>
+          </w:p>
+        </w:tc>
+        <w:tc>
+          <w:tcPr>
+            <w:tcW w:type="dxa" w:w="1707"/>
+            <w:vAlign w:val="center"/>
+          </w:tcPr>
+          <w:p>
+            <w:pPr>
+              <w:spacing w:after="0"/>
+            </w:pPr>
+            <w:r/>
+            <w:r>
+              <w:rPr>
+                <w:rFonts w:ascii="Aptos" w:hAnsi="Aptos"/>
+                <w:b w:val="0"/>
+                <w:sz w:val="14"/>
+              </w:rPr>
+              <w:t>20:34:05</w:t>
+            </w:r>
+          </w:p>
+        </w:tc>
+        <w:tc>
+          <w:tcPr>
+            <w:tcW w:type="dxa" w:w="1707"/>
+            <w:vAlign w:val="center"/>
+          </w:tcPr>
+          <w:p>
+            <w:pPr>
+              <w:spacing w:after="0"/>
+            </w:pPr>
+            <w:r/>
+            <w:r>
+              <w:rPr>
+                <w:rFonts w:ascii="Aptos" w:hAnsi="Aptos"/>
+                <w:b w:val="0"/>
+                <w:sz w:val="14"/>
+              </w:rPr>
+              <w:t>AccountControllerTest</w:t>
+            </w:r>
+          </w:p>
+        </w:tc>
+        <w:tc>
+          <w:tcPr>
+            <w:tcW w:type="dxa" w:w="1707"/>
+            <w:vAlign w:val="center"/>
+          </w:tcPr>
+          <w:p>
+            <w:pPr>
+              <w:spacing w:after="0"/>
+            </w:pPr>
+            <w:r/>
+            <w:r>
+              <w:rPr>
+                <w:rFonts w:ascii="Aptos" w:hAnsi="Aptos"/>
+                <w:b w:val="0"/>
+                <w:sz w:val="14"/>
+              </w:rPr>
+              <w:t>2</w:t>
+            </w:r>
+          </w:p>
+        </w:tc>
+        <w:tc>
+          <w:tcPr>
+            <w:tcW w:type="dxa" w:w="1707"/>
+            <w:vAlign w:val="center"/>
+          </w:tcPr>
+          <w:p>
+            <w:pPr>
+              <w:spacing w:after="0"/>
+            </w:pPr>
+            <w:r/>
+            <w:r>
+              <w:rPr>
+                <w:rFonts w:ascii="Aptos" w:hAnsi="Aptos"/>
+                <w:b w:val="0"/>
+                <w:sz w:val="14"/>
+              </w:rPr>
+              <w:t>2</w:t>
+            </w:r>
+          </w:p>
+        </w:tc>
+        <w:tc>
+          <w:tcPr>
+            <w:tcW w:type="dxa" w:w="1707"/>
+            <w:vAlign w:val="center"/>
+          </w:tcPr>
+          <w:p>
+            <w:pPr>
+              <w:spacing w:after="0"/>
+            </w:pPr>
+            <w:r/>
+            <w:r>
+              <w:rPr>
+                <w:rFonts w:ascii="Aptos" w:hAnsi="Aptos"/>
+                <w:b w:val="0"/>
+                <w:sz w:val="14"/>
+              </w:rPr>
+              <w:t>0</w:t>
+            </w:r>
+          </w:p>
+        </w:tc>
+        <w:tc>
+          <w:tcPr>
+            <w:tcW w:type="dxa" w:w="1707"/>
+            <w:vAlign w:val="center"/>
+          </w:tcPr>
+          <w:p>
+            <w:pPr>
+              <w:spacing w:after="0"/>
+            </w:pPr>
+            <w:r/>
+            <w:r>
+              <w:rPr>
+                <w:rFonts w:ascii="Aptos" w:hAnsi="Aptos"/>
+                <w:b w:val="0"/>
+                <w:sz w:val="14"/>
+              </w:rPr>
+              <w:t>0</w:t>
+            </w:r>
+          </w:p>
+        </w:tc>
+        <w:tc>
+          <w:tcPr>
+            <w:tcW w:type="dxa" w:w="1707"/>
+            <w:vAlign w:val="center"/>
+            <w:shd w:fill="E2F0D9"/>
+          </w:tcPr>
+          <w:p>
+            <w:pPr>
+              <w:spacing w:after="0"/>
+            </w:pPr>
+            <w:r/>
+            <w:r>
+              <w:rPr>
+                <w:rFonts w:ascii="Aptos" w:hAnsi="Aptos"/>
+                <w:b w:val="0"/>
+                <w:sz w:val="14"/>
+              </w:rPr>
+              <w:t>PASSOU</w:t>
+            </w:r>
+          </w:p>
+        </w:tc>
+        <w:tc>
+          <w:tcPr>
+            <w:tcW w:type="dxa" w:w="1707"/>
+            <w:vAlign w:val="center"/>
+          </w:tcPr>
+          <w:p>
+            <w:pPr>
+              <w:spacing w:after="0"/>
+            </w:pPr>
+            <w:r/>
+            <w:r>
+              <w:rPr>
+                <w:rFonts w:ascii="Aptos" w:hAnsi="Aptos"/>
+                <w:b w:val="0"/>
+                <w:sz w:val="14"/>
+              </w:rPr>
+              <w:t>Os dois novos cenários atenderam ao resultado esperado na primeira execução.</w:t>
+            </w:r>
+          </w:p>
+        </w:tc>
+      </w:tr>
+      <w:tr>
+        <w:trPr>
+          <w:cantSplit/>
+        </w:trPr>
+        <w:tc>
+          <w:tcPr>
+            <w:tcW w:type="dxa" w:w="1707"/>
+            <w:vAlign w:val="center"/>
+          </w:tcPr>
+          <w:p>
+            <w:pPr>
+              <w:spacing w:after="0"/>
+            </w:pPr>
+            <w:r/>
+            <w:r>
+              <w:rPr>
+                <w:rFonts w:ascii="Aptos" w:hAnsi="Aptos"/>
+                <w:b w:val="0"/>
+                <w:sz w:val="14"/>
+              </w:rPr>
+              <w:t>2</w:t>
+            </w:r>
+          </w:p>
+        </w:tc>
+        <w:tc>
+          <w:tcPr>
+            <w:tcW w:type="dxa" w:w="1707"/>
+            <w:vAlign w:val="center"/>
+          </w:tcPr>
+          <w:p>
+            <w:pPr>
+              <w:spacing w:after="0"/>
+            </w:pPr>
+            <w:r/>
+            <w:r>
+              <w:rPr>
+                <w:rFonts w:ascii="Aptos" w:hAnsi="Aptos"/>
+                <w:b w:val="0"/>
+                <w:sz w:val="14"/>
+              </w:rPr>
+              <w:t>20:34:29</w:t>
+            </w:r>
+          </w:p>
+        </w:tc>
+        <w:tc>
+          <w:tcPr>
+            <w:tcW w:type="dxa" w:w="1707"/>
+            <w:vAlign w:val="center"/>
+          </w:tcPr>
+          <w:p>
+            <w:pPr>
+              <w:spacing w:after="0"/>
+            </w:pPr>
+            <w:r/>
+            <w:r>
+              <w:rPr>
+                <w:rFonts w:ascii="Aptos" w:hAnsi="Aptos"/>
+                <w:b w:val="0"/>
+                <w:sz w:val="14"/>
+              </w:rPr>
+              <w:t>Maven clean verify</w:t>
+            </w:r>
+          </w:p>
+        </w:tc>
+        <w:tc>
+          <w:tcPr>
+            <w:tcW w:type="dxa" w:w="1707"/>
+            <w:vAlign w:val="center"/>
+          </w:tcPr>
+          <w:p>
+            <w:pPr>
+              <w:spacing w:after="0"/>
+            </w:pPr>
+            <w:r/>
+            <w:r>
+              <w:rPr>
+                <w:rFonts w:ascii="Aptos" w:hAnsi="Aptos"/>
+                <w:b w:val="0"/>
+                <w:sz w:val="14"/>
+              </w:rPr>
+              <w:t>18</w:t>
+            </w:r>
+          </w:p>
+        </w:tc>
+        <w:tc>
+          <w:tcPr>
+            <w:tcW w:type="dxa" w:w="1707"/>
+            <w:vAlign w:val="center"/>
+          </w:tcPr>
+          <w:p>
+            <w:pPr>
+              <w:spacing w:after="0"/>
+            </w:pPr>
+            <w:r/>
+            <w:r>
+              <w:rPr>
+                <w:rFonts w:ascii="Aptos" w:hAnsi="Aptos"/>
+                <w:b w:val="0"/>
+                <w:sz w:val="14"/>
+              </w:rPr>
+              <w:t>17</w:t>
+            </w:r>
+          </w:p>
+        </w:tc>
+        <w:tc>
+          <w:tcPr>
+            <w:tcW w:type="dxa" w:w="1707"/>
+            <w:vAlign w:val="center"/>
+          </w:tcPr>
+          <w:p>
+            <w:pPr>
+              <w:spacing w:after="0"/>
+            </w:pPr>
+            <w:r/>
+            <w:r>
+              <w:rPr>
+                <w:rFonts w:ascii="Aptos" w:hAnsi="Aptos"/>
+                <w:b w:val="0"/>
+                <w:sz w:val="14"/>
+              </w:rPr>
+              <w:t>0</w:t>
+            </w:r>
+          </w:p>
+        </w:tc>
+        <w:tc>
+          <w:tcPr>
+            <w:tcW w:type="dxa" w:w="1707"/>
+            <w:vAlign w:val="center"/>
+          </w:tcPr>
+          <w:p>
+            <w:pPr>
+              <w:spacing w:after="0"/>
+            </w:pPr>
+            <w:r/>
+            <w:r>
+              <w:rPr>
+                <w:rFonts w:ascii="Aptos" w:hAnsi="Aptos"/>
+                <w:b w:val="0"/>
+                <w:sz w:val="14"/>
+              </w:rPr>
+              <w:t>1</w:t>
+            </w:r>
+          </w:p>
+        </w:tc>
+        <w:tc>
+          <w:tcPr>
+            <w:tcW w:type="dxa" w:w="1707"/>
+            <w:vAlign w:val="center"/>
+            <w:shd w:fill="FCE4D6"/>
+          </w:tcPr>
+          <w:p>
+            <w:pPr>
+              <w:spacing w:after="0"/>
+            </w:pPr>
+            <w:r/>
+            <w:r>
+              <w:rPr>
+                <w:rFonts w:ascii="Aptos" w:hAnsi="Aptos"/>
+                <w:b w:val="0"/>
+                <w:sz w:val="14"/>
+              </w:rPr>
+              <w:t>FALHOU</w:t>
+            </w:r>
+          </w:p>
+        </w:tc>
+        <w:tc>
+          <w:tcPr>
+            <w:tcW w:type="dxa" w:w="1707"/>
+            <w:vAlign w:val="center"/>
+          </w:tcPr>
+          <w:p>
+            <w:pPr>
+              <w:spacing w:after="0"/>
+            </w:pPr>
+            <w:r/>
+            <w:r>
+              <w:rPr>
+                <w:rFonts w:ascii="Aptos" w:hAnsi="Aptos"/>
+                <w:b w:val="0"/>
+                <w:sz w:val="14"/>
+              </w:rPr>
+              <w:t>AccountEntityTest ainda procurava o antigo campo UserEntity.accountEntity.</w:t>
+            </w:r>
+          </w:p>
+        </w:tc>
+      </w:tr>
+      <w:tr>
+        <w:trPr>
+          <w:cantSplit/>
+        </w:trPr>
+        <w:tc>
+          <w:tcPr>
+            <w:tcW w:type="dxa" w:w="1707"/>
+            <w:vAlign w:val="center"/>
+          </w:tcPr>
+          <w:p>
+            <w:pPr>
+              <w:spacing w:after="0"/>
+            </w:pPr>
+            <w:r/>
+            <w:r>
+              <w:rPr>
+                <w:rFonts w:ascii="Aptos" w:hAnsi="Aptos"/>
+                <w:b w:val="0"/>
+                <w:sz w:val="14"/>
+              </w:rPr>
+              <w:t>3</w:t>
+            </w:r>
+          </w:p>
+        </w:tc>
+        <w:tc>
+          <w:tcPr>
+            <w:tcW w:type="dxa" w:w="1707"/>
+            <w:vAlign w:val="center"/>
+          </w:tcPr>
+          <w:p>
+            <w:pPr>
+              <w:spacing w:after="0"/>
+            </w:pPr>
+            <w:r/>
+            <w:r>
+              <w:rPr>
+                <w:rFonts w:ascii="Aptos" w:hAnsi="Aptos"/>
+                <w:b w:val="0"/>
+                <w:sz w:val="14"/>
+              </w:rPr>
+              <w:t>20:34:57</w:t>
+            </w:r>
+          </w:p>
+        </w:tc>
+        <w:tc>
+          <w:tcPr>
+            <w:tcW w:type="dxa" w:w="1707"/>
+            <w:vAlign w:val="center"/>
+          </w:tcPr>
+          <w:p>
+            <w:pPr>
+              <w:spacing w:after="0"/>
+            </w:pPr>
+            <w:r/>
+            <w:r>
+              <w:rPr>
+                <w:rFonts w:ascii="Aptos" w:hAnsi="Aptos"/>
+                <w:b w:val="0"/>
+                <w:sz w:val="14"/>
+              </w:rPr>
+              <w:t>AccountEntityTest</w:t>
+            </w:r>
+          </w:p>
+        </w:tc>
+        <w:tc>
+          <w:tcPr>
+            <w:tcW w:type="dxa" w:w="1707"/>
+            <w:vAlign w:val="center"/>
+          </w:tcPr>
+          <w:p>
+            <w:pPr>
+              <w:spacing w:after="0"/>
+            </w:pPr>
+            <w:r/>
+            <w:r>
+              <w:rPr>
+                <w:rFonts w:ascii="Aptos" w:hAnsi="Aptos"/>
+                <w:b w:val="0"/>
+                <w:sz w:val="14"/>
+              </w:rPr>
+              <w:t>9</w:t>
+            </w:r>
+          </w:p>
+        </w:tc>
+        <w:tc>
+          <w:tcPr>
+            <w:tcW w:type="dxa" w:w="1707"/>
+            <w:vAlign w:val="center"/>
+          </w:tcPr>
+          <w:p>
+            <w:pPr>
+              <w:spacing w:after="0"/>
+            </w:pPr>
+            <w:r/>
+            <w:r>
+              <w:rPr>
+                <w:rFonts w:ascii="Aptos" w:hAnsi="Aptos"/>
+                <w:b w:val="0"/>
+                <w:sz w:val="14"/>
+              </w:rPr>
+              <w:t>9</w:t>
+            </w:r>
+          </w:p>
+        </w:tc>
+        <w:tc>
+          <w:tcPr>
+            <w:tcW w:type="dxa" w:w="1707"/>
+            <w:vAlign w:val="center"/>
+          </w:tcPr>
+          <w:p>
+            <w:pPr>
+              <w:spacing w:after="0"/>
+            </w:pPr>
+            <w:r/>
+            <w:r>
+              <w:rPr>
+                <w:rFonts w:ascii="Aptos" w:hAnsi="Aptos"/>
+                <w:b w:val="0"/>
+                <w:sz w:val="14"/>
+              </w:rPr>
+              <w:t>0</w:t>
+            </w:r>
+          </w:p>
+        </w:tc>
+        <w:tc>
+          <w:tcPr>
+            <w:tcW w:type="dxa" w:w="1707"/>
+            <w:vAlign w:val="center"/>
+          </w:tcPr>
+          <w:p>
+            <w:pPr>
+              <w:spacing w:after="0"/>
+            </w:pPr>
+            <w:r/>
+            <w:r>
+              <w:rPr>
+                <w:rFonts w:ascii="Aptos" w:hAnsi="Aptos"/>
+                <w:b w:val="0"/>
+                <w:sz w:val="14"/>
+              </w:rPr>
+              <w:t>0</w:t>
+            </w:r>
+          </w:p>
+        </w:tc>
+        <w:tc>
+          <w:tcPr>
+            <w:tcW w:type="dxa" w:w="1707"/>
+            <w:vAlign w:val="center"/>
+            <w:shd w:fill="E2F0D9"/>
+          </w:tcPr>
+          <w:p>
+            <w:pPr>
+              <w:spacing w:after="0"/>
+            </w:pPr>
+            <w:r/>
+            <w:r>
+              <w:rPr>
+                <w:rFonts w:ascii="Aptos" w:hAnsi="Aptos"/>
+                <w:b w:val="0"/>
+                <w:sz w:val="14"/>
+              </w:rPr>
+              <w:t>PASSOU</w:t>
+            </w:r>
+          </w:p>
+        </w:tc>
+        <w:tc>
+          <w:tcPr>
+            <w:tcW w:type="dxa" w:w="1707"/>
+            <w:vAlign w:val="center"/>
+          </w:tcPr>
+          <w:p>
+            <w:pPr>
+              <w:spacing w:after="0"/>
+            </w:pPr>
+            <w:r/>
+            <w:r>
+              <w:rPr>
+                <w:rFonts w:ascii="Aptos" w:hAnsi="Aptos"/>
+                <w:b w:val="0"/>
+                <w:sz w:val="14"/>
+              </w:rPr>
+              <w:t>Teste corrigido para o campo UserEntity.account e reexecutado isoladamente.</w:t>
+            </w:r>
+          </w:p>
+        </w:tc>
+      </w:tr>
+      <w:tr>
+        <w:trPr>
+          <w:cantSplit/>
+        </w:trPr>
+        <w:tc>
+          <w:tcPr>
+            <w:tcW w:type="dxa" w:w="1707"/>
+            <w:vAlign w:val="center"/>
+          </w:tcPr>
+          <w:p>
+            <w:pPr>
+              <w:spacing w:after="0"/>
+            </w:pPr>
+            <w:r/>
+            <w:r>
+              <w:rPr>
+                <w:rFonts w:ascii="Aptos" w:hAnsi="Aptos"/>
+                <w:b w:val="0"/>
+                <w:sz w:val="14"/>
+              </w:rPr>
+              <w:t>4</w:t>
+            </w:r>
+          </w:p>
+        </w:tc>
+        <w:tc>
+          <w:tcPr>
+            <w:tcW w:type="dxa" w:w="1707"/>
+            <w:vAlign w:val="center"/>
+          </w:tcPr>
+          <w:p>
+            <w:pPr>
+              <w:spacing w:after="0"/>
+            </w:pPr>
+            <w:r/>
+            <w:r>
+              <w:rPr>
+                <w:rFonts w:ascii="Aptos" w:hAnsi="Aptos"/>
+                <w:b w:val="0"/>
+                <w:sz w:val="14"/>
+              </w:rPr>
+              <w:t>20:35:14</w:t>
+            </w:r>
+          </w:p>
+        </w:tc>
+        <w:tc>
+          <w:tcPr>
+            <w:tcW w:type="dxa" w:w="1707"/>
+            <w:vAlign w:val="center"/>
+          </w:tcPr>
+          <w:p>
+            <w:pPr>
+              <w:spacing w:after="0"/>
+            </w:pPr>
+            <w:r/>
+            <w:r>
+              <w:rPr>
+                <w:rFonts w:ascii="Aptos" w:hAnsi="Aptos"/>
+                <w:b w:val="0"/>
+                <w:sz w:val="14"/>
+              </w:rPr>
+              <w:t>Maven clean verify</w:t>
+            </w:r>
+          </w:p>
+        </w:tc>
+        <w:tc>
+          <w:tcPr>
+            <w:tcW w:type="dxa" w:w="1707"/>
+            <w:vAlign w:val="center"/>
+          </w:tcPr>
+          <w:p>
+            <w:pPr>
+              <w:spacing w:after="0"/>
+            </w:pPr>
+            <w:r/>
+            <w:r>
+              <w:rPr>
+                <w:rFonts w:ascii="Aptos" w:hAnsi="Aptos"/>
+                <w:b w:val="0"/>
+                <w:sz w:val="14"/>
+              </w:rPr>
+              <w:t>18</w:t>
+            </w:r>
+          </w:p>
+        </w:tc>
+        <w:tc>
+          <w:tcPr>
+            <w:tcW w:type="dxa" w:w="1707"/>
+            <w:vAlign w:val="center"/>
+          </w:tcPr>
+          <w:p>
+            <w:pPr>
+              <w:spacing w:after="0"/>
+            </w:pPr>
+            <w:r/>
+            <w:r>
+              <w:rPr>
+                <w:rFonts w:ascii="Aptos" w:hAnsi="Aptos"/>
+                <w:b w:val="0"/>
+                <w:sz w:val="14"/>
+              </w:rPr>
+              <w:t>18</w:t>
+            </w:r>
+          </w:p>
+        </w:tc>
+        <w:tc>
+          <w:tcPr>
+            <w:tcW w:type="dxa" w:w="1707"/>
+            <w:vAlign w:val="center"/>
+          </w:tcPr>
+          <w:p>
+            <w:pPr>
+              <w:spacing w:after="0"/>
+            </w:pPr>
+            <w:r/>
+            <w:r>
+              <w:rPr>
+                <w:rFonts w:ascii="Aptos" w:hAnsi="Aptos"/>
+                <w:b w:val="0"/>
+                <w:sz w:val="14"/>
+              </w:rPr>
+              <w:t>0</w:t>
+            </w:r>
+          </w:p>
+        </w:tc>
+        <w:tc>
+          <w:tcPr>
+            <w:tcW w:type="dxa" w:w="1707"/>
+            <w:vAlign w:val="center"/>
+          </w:tcPr>
+          <w:p>
+            <w:pPr>
+              <w:spacing w:after="0"/>
+            </w:pPr>
+            <w:r/>
+            <w:r>
+              <w:rPr>
+                <w:rFonts w:ascii="Aptos" w:hAnsi="Aptos"/>
+                <w:b w:val="0"/>
+                <w:sz w:val="14"/>
+              </w:rPr>
+              <w:t>0</w:t>
+            </w:r>
+          </w:p>
+        </w:tc>
+        <w:tc>
+          <w:tcPr>
+            <w:tcW w:type="dxa" w:w="1707"/>
+            <w:vAlign w:val="center"/>
+            <w:shd w:fill="E2F0D9"/>
+          </w:tcPr>
+          <w:p>
+            <w:pPr>
+              <w:spacing w:after="0"/>
+            </w:pPr>
+            <w:r/>
+            <w:r>
+              <w:rPr>
+                <w:rFonts w:ascii="Aptos" w:hAnsi="Aptos"/>
+                <w:b w:val="0"/>
+                <w:sz w:val="14"/>
+              </w:rPr>
+              <w:t>PASSOU</w:t>
+            </w:r>
+          </w:p>
+        </w:tc>
+        <w:tc>
+          <w:tcPr>
+            <w:tcW w:type="dxa" w:w="1707"/>
+            <w:vAlign w:val="center"/>
+          </w:tcPr>
+          <w:p>
+            <w:pPr>
+              <w:spacing w:after="0"/>
+            </w:pPr>
+            <w:r/>
+            <w:r>
+              <w:rPr>
+                <w:rFonts w:ascii="Aptos" w:hAnsi="Aptos"/>
+                <w:b w:val="0"/>
+                <w:sz w:val="14"/>
+              </w:rPr>
+              <w:t>Regressão completa aprovada e JAR executável gerado.</w:t>
+            </w:r>
+          </w:p>
+        </w:tc>
+      </w:tr>
+    </w:tbl>
+    <w:p>
+      <w:pPr>
+        <w:pStyle w:val="Heading2"/>
+      </w:pPr>
+      <w:r>
+        <w:t>5.2 Cenários, métodos e resultados</w:t>
+      </w:r>
+    </w:p>
+    <w:tbl>
+      <w:tblPr>
+        <w:tblStyle w:val="TableGrid"/>
+        <w:tblW w:type="auto" w:w="0"/>
+        <w:jc w:val="center"/>
+        <w:tblLook w:firstColumn="1" w:firstRow="1" w:lastColumn="0" w:lastRow="0" w:noHBand="0" w:noVBand="1" w:val="04A0"/>
+      </w:tblPr>
+      <w:tblGrid>
+        <w:gridCol w:w="2195"/>
+        <w:gridCol w:w="2195"/>
+        <w:gridCol w:w="2195"/>
+        <w:gridCol w:w="2195"/>
+        <w:gridCol w:w="2195"/>
+        <w:gridCol w:w="2195"/>
+        <w:gridCol w:w="2195"/>
+      </w:tblGrid>
+      <w:tr>
+        <w:tc>
+          <w:tcPr>
+            <w:tcW w:type="dxa" w:w="2195"/>
+            <w:vAlign w:val="center"/>
+            <w:shd w:fill="1F4E79"/>
+          </w:tcPr>
+          <w:p>
+            <w:pPr>
+              <w:spacing w:after="0"/>
+            </w:pPr>
+            <w:r/>
+            <w:r>
+              <w:rPr>
+                <w:rFonts w:ascii="Aptos" w:hAnsi="Aptos"/>
+                <w:b/>
+                <w:color w:val="FFFFFF"/>
+                <w:sz w:val="14"/>
+              </w:rPr>
+              <w:t>#</w:t>
+            </w:r>
+          </w:p>
+        </w:tc>
+        <w:tc>
+          <w:tcPr>
+            <w:tcW w:type="dxa" w:w="2195"/>
+            <w:vAlign w:val="center"/>
+            <w:shd w:fill="1F4E79"/>
+          </w:tcPr>
+          <w:p>
+            <w:pPr>
+              <w:spacing w:after="0"/>
+            </w:pPr>
+            <w:r/>
+            <w:r>
+              <w:rPr>
+                <w:rFonts w:ascii="Aptos" w:hAnsi="Aptos"/>
+                <w:b/>
+                <w:color w:val="FFFFFF"/>
+                <w:sz w:val="14"/>
+              </w:rPr>
+              <w:t>Método de teste</w:t>
+            </w:r>
+          </w:p>
+        </w:tc>
+        <w:tc>
+          <w:tcPr>
+            <w:tcW w:type="dxa" w:w="2195"/>
+            <w:vAlign w:val="center"/>
+            <w:shd w:fill="1F4E79"/>
+          </w:tcPr>
+          <w:p>
+            <w:pPr>
+              <w:spacing w:after="0"/>
+            </w:pPr>
+            <w:r/>
+            <w:r>
+              <w:rPr>
+                <w:rFonts w:ascii="Aptos" w:hAnsi="Aptos"/>
+                <w:b/>
+                <w:color w:val="FFFFFF"/>
+                <w:sz w:val="14"/>
+              </w:rPr>
+              <w:t>Cenário</w:t>
+            </w:r>
+          </w:p>
+        </w:tc>
+        <w:tc>
+          <w:tcPr>
+            <w:tcW w:type="dxa" w:w="2195"/>
+            <w:vAlign w:val="center"/>
+            <w:shd w:fill="1F4E79"/>
+          </w:tcPr>
+          <w:p>
+            <w:pPr>
+              <w:spacing w:after="0"/>
+            </w:pPr>
+            <w:r/>
+            <w:r>
+              <w:rPr>
+                <w:rFonts w:ascii="Aptos" w:hAnsi="Aptos"/>
+                <w:b/>
+                <w:color w:val="FFFFFF"/>
+                <w:sz w:val="14"/>
+              </w:rPr>
+              <w:t>Resultado esperado</w:t>
+            </w:r>
+          </w:p>
+        </w:tc>
+        <w:tc>
+          <w:tcPr>
+            <w:tcW w:type="dxa" w:w="2195"/>
+            <w:vAlign w:val="center"/>
+            <w:shd w:fill="1F4E79"/>
+          </w:tcPr>
+          <w:p>
+            <w:pPr>
+              <w:spacing w:after="0"/>
+            </w:pPr>
+            <w:r/>
+            <w:r>
+              <w:rPr>
+                <w:rFonts w:ascii="Aptos" w:hAnsi="Aptos"/>
+                <w:b/>
+                <w:color w:val="FFFFFF"/>
+                <w:sz w:val="14"/>
+              </w:rPr>
+              <w:t>Resultado obtido</w:t>
+            </w:r>
+          </w:p>
+        </w:tc>
+        <w:tc>
+          <w:tcPr>
+            <w:tcW w:type="dxa" w:w="2195"/>
+            <w:vAlign w:val="center"/>
+            <w:shd w:fill="1F4E79"/>
+          </w:tcPr>
+          <w:p>
+            <w:pPr>
+              <w:spacing w:after="0"/>
+            </w:pPr>
+            <w:r/>
+            <w:r>
+              <w:rPr>
+                <w:rFonts w:ascii="Aptos" w:hAnsi="Aptos"/>
+                <w:b/>
+                <w:color w:val="FFFFFF"/>
+                <w:sz w:val="14"/>
+              </w:rPr>
+              <w:t>Conforme?</w:t>
+            </w:r>
+          </w:p>
+        </w:tc>
+        <w:tc>
+          <w:tcPr>
+            <w:tcW w:type="dxa" w:w="2195"/>
+            <w:vAlign w:val="center"/>
+            <w:shd w:fill="1F4E79"/>
+          </w:tcPr>
+          <w:p>
+            <w:pPr>
+              <w:spacing w:after="0"/>
+            </w:pPr>
+            <w:r/>
+            <w:r>
+              <w:rPr>
+                <w:rFonts w:ascii="Aptos" w:hAnsi="Aptos"/>
+                <w:b/>
+                <w:color w:val="FFFFFF"/>
+                <w:sz w:val="14"/>
+              </w:rPr>
+              <w:t>Correção</w:t>
+            </w:r>
+          </w:p>
+        </w:tc>
+      </w:tr>
+      <w:tr>
+        <w:trPr>
+          <w:cantSplit/>
+        </w:trPr>
+        <w:tc>
+          <w:tcPr>
+            <w:tcW w:type="dxa" w:w="2195"/>
+            <w:vAlign w:val="center"/>
+          </w:tcPr>
+          <w:p>
+            <w:pPr>
+              <w:spacing w:after="0"/>
+            </w:pPr>
+            <w:r/>
+            <w:r>
+              <w:rPr>
+                <w:rFonts w:ascii="Aptos" w:hAnsi="Aptos"/>
+                <w:b w:val="0"/>
+                <w:sz w:val="14"/>
+              </w:rPr>
+              <w:t>17</w:t>
+            </w:r>
+          </w:p>
+        </w:tc>
+        <w:tc>
+          <w:tcPr>
+            <w:tcW w:type="dxa" w:w="2195"/>
+            <w:vAlign w:val="center"/>
+          </w:tcPr>
+          <w:p>
+            <w:pPr>
+              <w:spacing w:after="0"/>
+            </w:pPr>
+            <w:r/>
+            <w:r>
+              <w:rPr>
+                <w:rFonts w:ascii="Aptos" w:hAnsi="Aptos"/>
+                <w:b w:val="0"/>
+                <w:sz w:val="14"/>
+              </w:rPr>
+              <w:t>AccountControllerTest.findByUsernameShouldReturnAuthenticatedOwnersAccount</w:t>
+            </w:r>
+          </w:p>
+        </w:tc>
+        <w:tc>
+          <w:tcPr>
+            <w:tcW w:type="dxa" w:w="2195"/>
+            <w:vAlign w:val="center"/>
+          </w:tcPr>
+          <w:p>
+            <w:pPr>
+              <w:spacing w:after="0"/>
+            </w:pPr>
+            <w:r/>
+            <w:r>
+              <w:rPr>
+                <w:rFonts w:ascii="Aptos" w:hAnsi="Aptos"/>
+                <w:b w:val="0"/>
+                <w:sz w:val="14"/>
+              </w:rPr>
+              <w:t>GET /v1/account com a autenticação corrente e uma conta retornada pelo serviço mockado.</w:t>
+            </w:r>
+          </w:p>
+        </w:tc>
+        <w:tc>
+          <w:tcPr>
+            <w:tcW w:type="dxa" w:w="2195"/>
+            <w:vAlign w:val="center"/>
+          </w:tcPr>
+          <w:p>
+            <w:pPr>
+              <w:spacing w:after="0"/>
+            </w:pPr>
+            <w:r/>
+            <w:r>
+              <w:rPr>
+                <w:rFonts w:ascii="Aptos" w:hAnsi="Aptos"/>
+                <w:b w:val="0"/>
+                <w:sz w:val="14"/>
+              </w:rPr>
+              <w:t>HTTP 200; JSON com id, ownerName, balance, createAt e updateAt; mesma Authentication delegada uma vez.</w:t>
+            </w:r>
+          </w:p>
+        </w:tc>
+        <w:tc>
+          <w:tcPr>
+            <w:tcW w:type="dxa" w:w="2195"/>
+            <w:vAlign w:val="center"/>
+          </w:tcPr>
+          <w:p>
+            <w:pPr>
+              <w:spacing w:after="0"/>
+            </w:pPr>
+            <w:r/>
+            <w:r>
+              <w:rPr>
+                <w:rFonts w:ascii="Aptos" w:hAnsi="Aptos"/>
+                <w:b w:val="0"/>
+                <w:sz w:val="14"/>
+              </w:rPr>
+              <w:t>HTTP 200, cinco campos confirmados e mock verificado com a mesma autenticação, sem interações extras.</w:t>
+            </w:r>
+          </w:p>
+        </w:tc>
+        <w:tc>
+          <w:tcPr>
+            <w:tcW w:type="dxa" w:w="2195"/>
+            <w:vAlign w:val="center"/>
+            <w:shd w:fill="E2F0D9"/>
+          </w:tcPr>
+          <w:p>
+            <w:pPr>
+              <w:spacing w:after="0"/>
+            </w:pPr>
+            <w:r/>
+            <w:r>
+              <w:rPr>
+                <w:rFonts w:ascii="Aptos" w:hAnsi="Aptos"/>
+                <w:b w:val="0"/>
+                <w:sz w:val="14"/>
+              </w:rPr>
+              <w:t>SIM — PASSOU</w:t>
+            </w:r>
+          </w:p>
+        </w:tc>
+        <w:tc>
+          <w:tcPr>
+            <w:tcW w:type="dxa" w:w="2195"/>
+            <w:vAlign w:val="center"/>
+          </w:tcPr>
+          <w:p>
+            <w:pPr>
+              <w:spacing w:after="0"/>
+            </w:pPr>
+            <w:r/>
+            <w:r>
+              <w:rPr>
+                <w:rFonts w:ascii="Aptos" w:hAnsi="Aptos"/>
+                <w:b w:val="0"/>
+                <w:sz w:val="14"/>
+              </w:rPr>
+              <w:t>Nenhuma correção necessária.</w:t>
+            </w:r>
+          </w:p>
+        </w:tc>
+      </w:tr>
+      <w:tr>
+        <w:trPr>
+          <w:cantSplit/>
+        </w:trPr>
+        <w:tc>
+          <w:tcPr>
+            <w:tcW w:type="dxa" w:w="2195"/>
+            <w:vAlign w:val="center"/>
+          </w:tcPr>
+          <w:p>
+            <w:pPr>
+              <w:spacing w:after="0"/>
+            </w:pPr>
+            <w:r/>
+            <w:r>
+              <w:rPr>
+                <w:rFonts w:ascii="Aptos" w:hAnsi="Aptos"/>
+                <w:b w:val="0"/>
+                <w:sz w:val="14"/>
+              </w:rPr>
+              <w:t>18</w:t>
+            </w:r>
+          </w:p>
+        </w:tc>
+        <w:tc>
+          <w:tcPr>
+            <w:tcW w:type="dxa" w:w="2195"/>
+            <w:vAlign w:val="center"/>
+          </w:tcPr>
+          <w:p>
+            <w:pPr>
+              <w:spacing w:after="0"/>
+            </w:pPr>
+            <w:r/>
+            <w:r>
+              <w:rPr>
+                <w:rFonts w:ascii="Aptos" w:hAnsi="Aptos"/>
+                <w:b w:val="0"/>
+                <w:sz w:val="14"/>
+              </w:rPr>
+              <w:t>AccountControllerTest.findByUsernameShouldPropagateServiceExceptionWhenAccountDoesNotExist</w:t>
+            </w:r>
+          </w:p>
+        </w:tc>
+        <w:tc>
+          <w:tcPr>
+            <w:tcW w:type="dxa" w:w="2195"/>
+            <w:vAlign w:val="center"/>
+          </w:tcPr>
+          <w:p>
+            <w:pPr>
+              <w:spacing w:after="0"/>
+            </w:pPr>
+            <w:r/>
+            <w:r>
+              <w:rPr>
+                <w:rFonts w:ascii="Aptos" w:hAnsi="Aptos"/>
+                <w:b w:val="0"/>
+                <w:sz w:val="14"/>
+              </w:rPr>
+              <w:t>AccountService lança UsernameNotFoundException para a autenticação corrente.</w:t>
+            </w:r>
+          </w:p>
+        </w:tc>
+        <w:tc>
+          <w:tcPr>
+            <w:tcW w:type="dxa" w:w="2195"/>
+            <w:vAlign w:val="center"/>
+          </w:tcPr>
+          <w:p>
+            <w:pPr>
+              <w:spacing w:after="0"/>
+            </w:pPr>
+            <w:r/>
+            <w:r>
+              <w:rPr>
+                <w:rFonts w:ascii="Aptos" w:hAnsi="Aptos"/>
+                <w:b w:val="0"/>
+                <w:sz w:val="14"/>
+              </w:rPr>
+              <w:t>Controller propaga exatamente a mesma exceção e chama o serviço uma vez.</w:t>
+            </w:r>
+          </w:p>
+        </w:tc>
+        <w:tc>
+          <w:tcPr>
+            <w:tcW w:type="dxa" w:w="2195"/>
+            <w:vAlign w:val="center"/>
+          </w:tcPr>
+          <w:p>
+            <w:pPr>
+              <w:spacing w:after="0"/>
+            </w:pPr>
+            <w:r/>
+            <w:r>
+              <w:rPr>
+                <w:rFonts w:ascii="Aptos" w:hAnsi="Aptos"/>
+                <w:b w:val="0"/>
+                <w:sz w:val="14"/>
+              </w:rPr>
+              <w:t>Mesma instância propagada; chamada única e nenhuma interação adicional confirmadas.</w:t>
+            </w:r>
+          </w:p>
+        </w:tc>
+        <w:tc>
+          <w:tcPr>
+            <w:tcW w:type="dxa" w:w="2195"/>
+            <w:vAlign w:val="center"/>
+            <w:shd w:fill="E2F0D9"/>
+          </w:tcPr>
+          <w:p>
+            <w:pPr>
+              <w:spacing w:after="0"/>
+            </w:pPr>
+            <w:r/>
+            <w:r>
+              <w:rPr>
+                <w:rFonts w:ascii="Aptos" w:hAnsi="Aptos"/>
+                <w:b w:val="0"/>
+                <w:sz w:val="14"/>
+              </w:rPr>
+              <w:t>SIM — PASSOU</w:t>
+            </w:r>
+          </w:p>
+        </w:tc>
+        <w:tc>
+          <w:tcPr>
+            <w:tcW w:type="dxa" w:w="2195"/>
+            <w:vAlign w:val="center"/>
+          </w:tcPr>
+          <w:p>
+            <w:pPr>
+              <w:spacing w:after="0"/>
+            </w:pPr>
+            <w:r/>
+            <w:r>
+              <w:rPr>
+                <w:rFonts w:ascii="Aptos" w:hAnsi="Aptos"/>
+                <w:b w:val="0"/>
+                <w:sz w:val="14"/>
+              </w:rPr>
+              <w:t>Nenhuma correção necessária.</w:t>
+            </w:r>
+          </w:p>
+        </w:tc>
+      </w:tr>
+    </w:tbl>
+    <w:p>
+      <w:pPr>
+        <w:pStyle w:val="Heading2"/>
+      </w:pPr>
+      <w:r>
+        <w:t>5.3 Divergência encontrada e correção</w:t>
+      </w:r>
+    </w:p>
+    <w:tbl>
+      <w:tblPr>
+        <w:tblStyle w:val="TableGrid"/>
+        <w:tblW w:type="auto" w:w="0"/>
+        <w:jc w:val="center"/>
+        <w:tblLook w:firstColumn="1" w:firstRow="1" w:lastColumn="0" w:lastRow="0" w:noHBand="0" w:noVBand="1" w:val="04A0"/>
+      </w:tblPr>
+      <w:tblGrid>
+        <w:gridCol w:w="3841"/>
+        <w:gridCol w:w="3841"/>
+        <w:gridCol w:w="3841"/>
+        <w:gridCol w:w="3841"/>
+      </w:tblGrid>
+      <w:tr>
+        <w:tc>
+          <w:tcPr>
+            <w:tcW w:type="dxa" w:w="3841"/>
+            <w:vAlign w:val="center"/>
+            <w:shd w:fill="1F4E79"/>
+          </w:tcPr>
+          <w:p>
+            <w:pPr>
+              <w:spacing w:after="0"/>
+            </w:pPr>
+            <w:r/>
+            <w:r>
+              <w:rPr>
+                <w:rFonts w:ascii="Aptos" w:hAnsi="Aptos"/>
+                <w:b/>
+                <w:color w:val="FFFFFF"/>
+                <w:sz w:val="14"/>
+              </w:rPr>
+              <w:t>Arquivo</w:t>
+            </w:r>
+          </w:p>
+        </w:tc>
+        <w:tc>
+          <w:tcPr>
+            <w:tcW w:type="dxa" w:w="3841"/>
+            <w:vAlign w:val="center"/>
+            <w:shd w:fill="1F4E79"/>
+          </w:tcPr>
+          <w:p>
+            <w:pPr>
+              <w:spacing w:after="0"/>
+            </w:pPr>
+            <w:r/>
+            <w:r>
+              <w:rPr>
+                <w:rFonts w:ascii="Aptos" w:hAnsi="Aptos"/>
+                <w:b/>
+                <w:color w:val="FFFFFF"/>
+                <w:sz w:val="14"/>
+              </w:rPr>
+              <w:t>Problema confirmado</w:t>
+            </w:r>
+          </w:p>
+        </w:tc>
+        <w:tc>
+          <w:tcPr>
+            <w:tcW w:type="dxa" w:w="3841"/>
+            <w:vAlign w:val="center"/>
+            <w:shd w:fill="1F4E79"/>
+          </w:tcPr>
+          <w:p>
+            <w:pPr>
+              <w:spacing w:after="0"/>
+            </w:pPr>
+            <w:r/>
+            <w:r>
+              <w:rPr>
+                <w:rFonts w:ascii="Aptos" w:hAnsi="Aptos"/>
+                <w:b/>
+                <w:color w:val="FFFFFF"/>
+                <w:sz w:val="14"/>
+              </w:rPr>
+              <w:t>Correção aplicada</w:t>
+            </w:r>
+          </w:p>
+        </w:tc>
+        <w:tc>
+          <w:tcPr>
+            <w:tcW w:type="dxa" w:w="3841"/>
+            <w:vAlign w:val="center"/>
+            <w:shd w:fill="1F4E79"/>
+          </w:tcPr>
+          <w:p>
+            <w:pPr>
+              <w:spacing w:after="0"/>
+            </w:pPr>
+            <w:r/>
+            <w:r>
+              <w:rPr>
+                <w:rFonts w:ascii="Aptos" w:hAnsi="Aptos"/>
+                <w:b/>
+                <w:color w:val="FFFFFF"/>
+                <w:sz w:val="14"/>
+              </w:rPr>
+              <w:t>Validação</w:t>
+            </w:r>
+          </w:p>
+        </w:tc>
+      </w:tr>
+      <w:tr>
+        <w:trPr>
+          <w:cantSplit/>
+        </w:trPr>
+        <w:tc>
+          <w:tcPr>
+            <w:tcW w:type="dxa" w:w="3841"/>
+            <w:vAlign w:val="center"/>
+          </w:tcPr>
+          <w:p>
+            <w:pPr>
+              <w:spacing w:after="0"/>
+            </w:pPr>
+            <w:r/>
+            <w:r>
+              <w:rPr>
+                <w:rFonts w:ascii="Aptos" w:hAnsi="Aptos"/>
+                <w:b w:val="0"/>
+                <w:sz w:val="14"/>
+              </w:rPr>
+              <w:t>AccountEntityTest.java</w:t>
+            </w:r>
+          </w:p>
+        </w:tc>
+        <w:tc>
+          <w:tcPr>
+            <w:tcW w:type="dxa" w:w="3841"/>
+            <w:vAlign w:val="center"/>
+          </w:tcPr>
+          <w:p>
+            <w:pPr>
+              <w:spacing w:after="0"/>
+            </w:pPr>
+            <w:r/>
+            <w:r>
+              <w:rPr>
+                <w:rFonts w:ascii="Aptos" w:hAnsi="Aptos"/>
+                <w:b w:val="0"/>
+                <w:sz w:val="14"/>
+              </w:rPr>
+              <w:t>A nova implementação renomeou UserEntity.accountEntity para UserEntity.account, mas o teste por reflexão continuava procurando o nome antigo.</w:t>
+            </w:r>
+          </w:p>
+        </w:tc>
+        <w:tc>
+          <w:tcPr>
+            <w:tcW w:type="dxa" w:w="3841"/>
+            <w:vAlign w:val="center"/>
+          </w:tcPr>
+          <w:p>
+            <w:pPr>
+              <w:spacing w:after="0"/>
+            </w:pPr>
+            <w:r/>
+            <w:r>
+              <w:rPr>
+                <w:rFonts w:ascii="Aptos" w:hAnsi="Aptos"/>
+                <w:b w:val="0"/>
+                <w:sz w:val="14"/>
+              </w:rPr>
+              <w:t>A referência em getDeclaredField foi atualizada de accountEntity para account. Nenhuma alteração no relacionamento JPA foi necessária.</w:t>
+            </w:r>
+          </w:p>
+        </w:tc>
+        <w:tc>
+          <w:tcPr>
+            <w:tcW w:type="dxa" w:w="3841"/>
+            <w:vAlign w:val="center"/>
+          </w:tcPr>
+          <w:p>
+            <w:pPr>
+              <w:spacing w:after="0"/>
+            </w:pPr>
+            <w:r/>
+            <w:r>
+              <w:rPr>
+                <w:rFonts w:ascii="Aptos" w:hAnsi="Aptos"/>
+                <w:b w:val="0"/>
+                <w:sz w:val="14"/>
+              </w:rPr>
+              <w:t>AccountEntityTest: 9/9; suíte final: 18/18.</w:t>
+            </w:r>
+          </w:p>
+        </w:tc>
+      </w:tr>
+    </w:tbl>
+    <w:p>
+      <w:r>
+        <w:rPr>
+          <w:b/>
+        </w:rPr>
+        <w:t xml:space="preserve">Conclusão desta execução: </w:t>
+      </w:r>
+      <w:r>
+        <w:t>os dois cenários do AccountController corresponderam aos resultados esperados. A única divergência estava em um teste legado afetado pela renomeação de um campo; após a atualização, toda a suíte ficou verde.</w:t>
+      </w:r>
+    </w:p>
     <w:sectPr>
       <w:footerReference w:type="default" r:id="rId9"/>
       <w:pgSz w:w="16838" w:h="11906" w:orient="landscape"/>

</xml_diff>

<commit_message>
feat(account): add new version Historico_de_Testes_LedgerCore.docx
</commit_message>
<xml_diff>
--- a/docs/Historico_de_Testes_LedgerCore.docx
+++ b/docs/Historico_de_Testes_LedgerCore.docx
@@ -117,9 +117,9 @@
               <w:rPr>
                 <w:rFonts w:ascii="Aptos" w:hAnsi="Aptos"/>
                 <w:b w:val="0"/>
-                <w:sz w:val="18"/>
-              </w:rPr>
-              <w:t>15/10/2026 — 20:35 (America/Sao_Paulo)</w:t>
+                <w:sz w:val="16"/>
+              </w:rPr>
+              <w:t>15/10/2026 — 20:43 (America/Sao_Paulo)</w:t>
             </w:r>
           </w:p>
         </w:tc>
@@ -204,7 +204,7 @@
               <w:rPr>
                 <w:rFonts w:ascii="Aptos" w:hAnsi="Aptos"/>
                 <w:b w:val="0"/>
-                <w:sz w:val="18"/>
+                <w:sz w:val="16"/>
               </w:rPr>
               <w:t>mvn clean verify</w:t>
             </w:r>
@@ -283,6 +283,7 @@
             <w:vAlign w:val="center"/>
             <w:shd w:fill="E2F0D9"/>
             <w:shd w:fill="E2F0D9"/>
+            <w:shd w:fill="E2F0D9"/>
           </w:tcPr>
           <w:p>
             <w:pPr>
@@ -293,7 +294,7 @@
               <w:rPr>
                 <w:rFonts w:ascii="Aptos" w:hAnsi="Aptos"/>
                 <w:b/>
-                <w:sz w:val="18"/>
+                <w:sz w:val="16"/>
               </w:rPr>
               <w:t>SUCESSO</w:t>
             </w:r>
@@ -331,6 +332,28 @@
             <w:vAlign w:val="center"/>
             <w:shd w:fill="E2F0D9"/>
             <w:shd w:fill="E2F0D9"/>
+            <w:shd w:fill="E2F0D9"/>
+          </w:tcPr>
+          <w:p>
+            <w:pPr>
+              <w:spacing w:after="0"/>
+            </w:pPr>
+            <w:r/>
+            <w:r>
+              <w:rPr>
+                <w:rFonts w:ascii="Aptos" w:hAnsi="Aptos"/>
+                <w:b/>
+                <w:sz w:val="16"/>
+              </w:rPr>
+              <w:t>18 executados • 18 aprovados</w:t>
+            </w:r>
+          </w:p>
+        </w:tc>
+        <w:tc>
+          <w:tcPr>
+            <w:tcW w:type="dxa" w:w="1757"/>
+            <w:vAlign w:val="center"/>
+            <w:shd w:fill="D9EAF7"/>
           </w:tcPr>
           <w:p>
             <w:pPr>
@@ -343,27 +366,6 @@
                 <w:b/>
                 <w:sz w:val="18"/>
               </w:rPr>
-              <w:t>18 executados • 18 aprovados</w:t>
-            </w:r>
-          </w:p>
-        </w:tc>
-        <w:tc>
-          <w:tcPr>
-            <w:tcW w:type="dxa" w:w="1757"/>
-            <w:vAlign w:val="center"/>
-            <w:shd w:fill="D9EAF7"/>
-          </w:tcPr>
-          <w:p>
-            <w:pPr>
-              <w:spacing w:after="0"/>
-            </w:pPr>
-            <w:r/>
-            <w:r>
-              <w:rPr>
-                <w:rFonts w:ascii="Aptos" w:hAnsi="Aptos"/>
-                <w:b/>
-                <w:sz w:val="18"/>
-              </w:rPr>
               <w:t>Falhas / erros / ignorados</w:t>
             </w:r>
           </w:p>
@@ -382,7 +384,7 @@
               <w:rPr>
                 <w:rFonts w:ascii="Aptos" w:hAnsi="Aptos"/>
                 <w:b w:val="0"/>
-                <w:sz w:val="18"/>
+                <w:sz w:val="16"/>
               </w:rPr>
               <w:t>0 / 0 / 0</w:t>
             </w:r>
@@ -6709,6 +6711,444 @@
       </w:r>
       <w:r>
         <w:t>os dois cenários do AccountController corresponderam aos resultados esperados. A única divergência estava em um teste legado afetado pela renomeação de um campo; após a atualização, toda a suíte ficou verde.</w:t>
+      </w:r>
+    </w:p>
+    <w:p>
+      <w:r>
+        <w:br w:type="page"/>
+      </w:r>
+    </w:p>
+    <w:p>
+      <w:pPr>
+        <w:pStyle w:val="Heading1"/>
+      </w:pPr>
+      <w:r>
+        <w:t>6. Processo obrigatório para novas implementações</w:t>
+      </w:r>
+    </w:p>
+    <w:p>
+      <w:r>
+        <w:t>A partir desta execução, cada nova implementação deve seguir a ordem abaixo. A suíte completa é executada antes dos novos testes para estabelecer uma linha de base e novamente ao final para detectar regressões.</w:t>
+      </w:r>
+    </w:p>
+    <w:p>
+      <w:pPr>
+        <w:pStyle w:val="ListNumber"/>
+      </w:pPr>
+      <w:r>
+        <w:t>Executar toda a suíte existente com mvn clean verify imediatamente após receber a nova implementação.</w:t>
+      </w:r>
+    </w:p>
+    <w:p>
+      <w:pPr>
+        <w:pStyle w:val="ListNumber"/>
+      </w:pPr>
+      <w:r>
+        <w:t>Registrar exclusivamente neste DOCX o resultado da linha de base e os cenários planejados para a nova implementação.</w:t>
+      </w:r>
+    </w:p>
+    <w:p>
+      <w:pPr>
+        <w:pStyle w:val="ListNumber"/>
+      </w:pPr>
+      <w:r>
+        <w:t>Criar os novos métodos de teste com JUnit, Mockito e as ferramentas adequadas ao componente.</w:t>
+      </w:r>
+    </w:p>
+    <w:p>
+      <w:pPr>
+        <w:pStyle w:val="ListNumber"/>
+      </w:pPr>
+      <w:r>
+        <w:t>Executar os novos testes de forma direcionada e comparar o resultado obtido com o esperado.</w:t>
+      </w:r>
+    </w:p>
+    <w:p>
+      <w:pPr>
+        <w:pStyle w:val="ListNumber"/>
+      </w:pPr>
+      <w:r>
+        <w:t>Corrigir divergências confirmadas e documentar o problema e a correção na tabela da execução.</w:t>
+      </w:r>
+    </w:p>
+    <w:p>
+      <w:pPr>
+        <w:pStyle w:val="ListNumber"/>
+      </w:pPr>
+      <w:r>
+        <w:t>Executar novamente toda a suíte com mvn clean verify e registrar o resultado final de regressão.</w:t>
+      </w:r>
+    </w:p>
+    <w:p>
+      <w:pPr>
+        <w:pStyle w:val="Heading2"/>
+      </w:pPr>
+      <w:r>
+        <w:t>6.1 Confirmação da linha de base</w:t>
+      </w:r>
+    </w:p>
+    <w:tbl>
+      <w:tblPr>
+        <w:tblStyle w:val="TableGrid"/>
+        <w:tblW w:type="auto" w:w="0"/>
+        <w:jc w:val="center"/>
+        <w:tblLook w:firstColumn="1" w:firstRow="1" w:lastColumn="0" w:lastRow="0" w:noHBand="0" w:noVBand="1" w:val="04A0"/>
+      </w:tblPr>
+      <w:tblGrid>
+        <w:gridCol w:w="1920"/>
+        <w:gridCol w:w="1920"/>
+        <w:gridCol w:w="1920"/>
+        <w:gridCol w:w="1920"/>
+        <w:gridCol w:w="1920"/>
+        <w:gridCol w:w="1920"/>
+        <w:gridCol w:w="1920"/>
+        <w:gridCol w:w="1920"/>
+      </w:tblGrid>
+      <w:tr>
+        <w:tc>
+          <w:tcPr>
+            <w:tcW w:type="dxa" w:w="1920"/>
+            <w:vAlign w:val="center"/>
+            <w:shd w:fill="1F4E79"/>
+          </w:tcPr>
+          <w:p>
+            <w:pPr>
+              <w:spacing w:after="0"/>
+            </w:pPr>
+            <w:r/>
+            <w:r>
+              <w:rPr>
+                <w:rFonts w:ascii="Aptos" w:hAnsi="Aptos"/>
+                <w:b/>
+                <w:color w:val="FFFFFF"/>
+                <w:sz w:val="16"/>
+              </w:rPr>
+              <w:t>Data</w:t>
+            </w:r>
+          </w:p>
+        </w:tc>
+        <w:tc>
+          <w:tcPr>
+            <w:tcW w:type="dxa" w:w="1920"/>
+            <w:vAlign w:val="center"/>
+            <w:shd w:fill="1F4E79"/>
+          </w:tcPr>
+          <w:p>
+            <w:pPr>
+              <w:spacing w:after="0"/>
+            </w:pPr>
+            <w:r/>
+            <w:r>
+              <w:rPr>
+                <w:rFonts w:ascii="Aptos" w:hAnsi="Aptos"/>
+                <w:b/>
+                <w:color w:val="FFFFFF"/>
+                <w:sz w:val="16"/>
+              </w:rPr>
+              <w:t>Horário</w:t>
+            </w:r>
+          </w:p>
+        </w:tc>
+        <w:tc>
+          <w:tcPr>
+            <w:tcW w:type="dxa" w:w="1920"/>
+            <w:vAlign w:val="center"/>
+            <w:shd w:fill="1F4E79"/>
+          </w:tcPr>
+          <w:p>
+            <w:pPr>
+              <w:spacing w:after="0"/>
+            </w:pPr>
+            <w:r/>
+            <w:r>
+              <w:rPr>
+                <w:rFonts w:ascii="Aptos" w:hAnsi="Aptos"/>
+                <w:b/>
+                <w:color w:val="FFFFFF"/>
+                <w:sz w:val="16"/>
+              </w:rPr>
+              <w:t>Comando</w:t>
+            </w:r>
+          </w:p>
+        </w:tc>
+        <w:tc>
+          <w:tcPr>
+            <w:tcW w:type="dxa" w:w="1920"/>
+            <w:vAlign w:val="center"/>
+            <w:shd w:fill="1F4E79"/>
+          </w:tcPr>
+          <w:p>
+            <w:pPr>
+              <w:spacing w:after="0"/>
+            </w:pPr>
+            <w:r/>
+            <w:r>
+              <w:rPr>
+                <w:rFonts w:ascii="Aptos" w:hAnsi="Aptos"/>
+                <w:b/>
+                <w:color w:val="FFFFFF"/>
+                <w:sz w:val="16"/>
+              </w:rPr>
+              <w:t>Executados</w:t>
+            </w:r>
+          </w:p>
+        </w:tc>
+        <w:tc>
+          <w:tcPr>
+            <w:tcW w:type="dxa" w:w="1920"/>
+            <w:vAlign w:val="center"/>
+            <w:shd w:fill="1F4E79"/>
+          </w:tcPr>
+          <w:p>
+            <w:pPr>
+              <w:spacing w:after="0"/>
+            </w:pPr>
+            <w:r/>
+            <w:r>
+              <w:rPr>
+                <w:rFonts w:ascii="Aptos" w:hAnsi="Aptos"/>
+                <w:b/>
+                <w:color w:val="FFFFFF"/>
+                <w:sz w:val="16"/>
+              </w:rPr>
+              <w:t>Aprovados</w:t>
+            </w:r>
+          </w:p>
+        </w:tc>
+        <w:tc>
+          <w:tcPr>
+            <w:tcW w:type="dxa" w:w="1920"/>
+            <w:vAlign w:val="center"/>
+            <w:shd w:fill="1F4E79"/>
+          </w:tcPr>
+          <w:p>
+            <w:pPr>
+              <w:spacing w:after="0"/>
+            </w:pPr>
+            <w:r/>
+            <w:r>
+              <w:rPr>
+                <w:rFonts w:ascii="Aptos" w:hAnsi="Aptos"/>
+                <w:b/>
+                <w:color w:val="FFFFFF"/>
+                <w:sz w:val="16"/>
+              </w:rPr>
+              <w:t>Falhas</w:t>
+            </w:r>
+          </w:p>
+        </w:tc>
+        <w:tc>
+          <w:tcPr>
+            <w:tcW w:type="dxa" w:w="1920"/>
+            <w:vAlign w:val="center"/>
+            <w:shd w:fill="1F4E79"/>
+          </w:tcPr>
+          <w:p>
+            <w:pPr>
+              <w:spacing w:after="0"/>
+            </w:pPr>
+            <w:r/>
+            <w:r>
+              <w:rPr>
+                <w:rFonts w:ascii="Aptos" w:hAnsi="Aptos"/>
+                <w:b/>
+                <w:color w:val="FFFFFF"/>
+                <w:sz w:val="16"/>
+              </w:rPr>
+              <w:t>Erros</w:t>
+            </w:r>
+          </w:p>
+        </w:tc>
+        <w:tc>
+          <w:tcPr>
+            <w:tcW w:type="dxa" w:w="1920"/>
+            <w:vAlign w:val="center"/>
+            <w:shd w:fill="1F4E79"/>
+          </w:tcPr>
+          <w:p>
+            <w:pPr>
+              <w:spacing w:after="0"/>
+            </w:pPr>
+            <w:r/>
+            <w:r>
+              <w:rPr>
+                <w:rFonts w:ascii="Aptos" w:hAnsi="Aptos"/>
+                <w:b/>
+                <w:color w:val="FFFFFF"/>
+                <w:sz w:val="16"/>
+              </w:rPr>
+              <w:t>Status</w:t>
+            </w:r>
+          </w:p>
+        </w:tc>
+      </w:tr>
+      <w:tr>
+        <w:tc>
+          <w:tcPr>
+            <w:tcW w:type="dxa" w:w="1920"/>
+            <w:vAlign w:val="center"/>
+          </w:tcPr>
+          <w:p>
+            <w:pPr>
+              <w:spacing w:after="0"/>
+            </w:pPr>
+            <w:r/>
+            <w:r>
+              <w:rPr>
+                <w:rFonts w:ascii="Aptos" w:hAnsi="Aptos"/>
+                <w:b w:val="0"/>
+                <w:sz w:val="16"/>
+              </w:rPr>
+              <w:t>15/10/2026</w:t>
+            </w:r>
+          </w:p>
+        </w:tc>
+        <w:tc>
+          <w:tcPr>
+            <w:tcW w:type="dxa" w:w="1920"/>
+            <w:vAlign w:val="center"/>
+          </w:tcPr>
+          <w:p>
+            <w:pPr>
+              <w:spacing w:after="0"/>
+            </w:pPr>
+            <w:r/>
+            <w:r>
+              <w:rPr>
+                <w:rFonts w:ascii="Aptos" w:hAnsi="Aptos"/>
+                <w:b w:val="0"/>
+                <w:sz w:val="16"/>
+              </w:rPr>
+              <w:t>20:43:42</w:t>
+            </w:r>
+          </w:p>
+        </w:tc>
+        <w:tc>
+          <w:tcPr>
+            <w:tcW w:type="dxa" w:w="1920"/>
+            <w:vAlign w:val="center"/>
+          </w:tcPr>
+          <w:p>
+            <w:pPr>
+              <w:spacing w:after="0"/>
+            </w:pPr>
+            <w:r/>
+            <w:r>
+              <w:rPr>
+                <w:rFonts w:ascii="Aptos" w:hAnsi="Aptos"/>
+                <w:b w:val="0"/>
+                <w:sz w:val="16"/>
+              </w:rPr>
+              <w:t>mvn clean verify</w:t>
+            </w:r>
+          </w:p>
+        </w:tc>
+        <w:tc>
+          <w:tcPr>
+            <w:tcW w:type="dxa" w:w="1920"/>
+            <w:vAlign w:val="center"/>
+          </w:tcPr>
+          <w:p>
+            <w:pPr>
+              <w:spacing w:after="0"/>
+            </w:pPr>
+            <w:r/>
+            <w:r>
+              <w:rPr>
+                <w:rFonts w:ascii="Aptos" w:hAnsi="Aptos"/>
+                <w:b w:val="0"/>
+                <w:sz w:val="16"/>
+              </w:rPr>
+              <w:t>18</w:t>
+            </w:r>
+          </w:p>
+        </w:tc>
+        <w:tc>
+          <w:tcPr>
+            <w:tcW w:type="dxa" w:w="1920"/>
+            <w:vAlign w:val="center"/>
+          </w:tcPr>
+          <w:p>
+            <w:pPr>
+              <w:spacing w:after="0"/>
+            </w:pPr>
+            <w:r/>
+            <w:r>
+              <w:rPr>
+                <w:rFonts w:ascii="Aptos" w:hAnsi="Aptos"/>
+                <w:b w:val="0"/>
+                <w:sz w:val="16"/>
+              </w:rPr>
+              <w:t>18</w:t>
+            </w:r>
+          </w:p>
+        </w:tc>
+        <w:tc>
+          <w:tcPr>
+            <w:tcW w:type="dxa" w:w="1920"/>
+            <w:vAlign w:val="center"/>
+          </w:tcPr>
+          <w:p>
+            <w:pPr>
+              <w:spacing w:after="0"/>
+            </w:pPr>
+            <w:r/>
+            <w:r>
+              <w:rPr>
+                <w:rFonts w:ascii="Aptos" w:hAnsi="Aptos"/>
+                <w:b w:val="0"/>
+                <w:sz w:val="16"/>
+              </w:rPr>
+              <w:t>0</w:t>
+            </w:r>
+          </w:p>
+        </w:tc>
+        <w:tc>
+          <w:tcPr>
+            <w:tcW w:type="dxa" w:w="1920"/>
+            <w:vAlign w:val="center"/>
+          </w:tcPr>
+          <w:p>
+            <w:pPr>
+              <w:spacing w:after="0"/>
+            </w:pPr>
+            <w:r/>
+            <w:r>
+              <w:rPr>
+                <w:rFonts w:ascii="Aptos" w:hAnsi="Aptos"/>
+                <w:b w:val="0"/>
+                <w:sz w:val="16"/>
+              </w:rPr>
+              <w:t>0</w:t>
+            </w:r>
+          </w:p>
+        </w:tc>
+        <w:tc>
+          <w:tcPr>
+            <w:tcW w:type="dxa" w:w="1920"/>
+            <w:vAlign w:val="center"/>
+            <w:shd w:fill="E2F0D9"/>
+          </w:tcPr>
+          <w:p>
+            <w:pPr>
+              <w:spacing w:after="0"/>
+            </w:pPr>
+            <w:r/>
+            <w:r>
+              <w:rPr>
+                <w:rFonts w:ascii="Aptos" w:hAnsi="Aptos"/>
+                <w:b w:val="0"/>
+                <w:sz w:val="16"/>
+              </w:rPr>
+              <w:t>PASSOU</w:t>
+            </w:r>
+          </w:p>
+        </w:tc>
+      </w:tr>
+    </w:tbl>
+    <w:p>
+      <w:r>
+        <w:t>Resultado: todas as cinco classes de teste foram aprovadas, sem falhas, erros ou casos ignorados; o JAR executável também foi gerado com sucesso.</w:t>
       </w:r>
     </w:p>
     <w:sectPr>

</xml_diff>